<commit_message>
Portal 76: Report Reviewer from Auditor Pool (FR.231 / FR.232)
- db_models.py: reviewer_auditor_id + reviewer_auditor_name columns on AuditSetAuditReport
- report_router.py: _notify_reviewer helper, _check_reviewer_auth (admin/CM bypass + assigned auditor + legacy fallback), assign_reviewer PUT endpoint, get_reviewer_candidates GET endpoint, review_sign_direct updated
- AuditReportSection.tsx: Assign Reviewer / Change Reviewer button, reviewer panel with eligible auditors dropdown
- auditor/audit/[id]/page.tsx: OTP signing panel for assigned auditor reviewer
</commit_message>
<xml_diff>
--- a/backend/uaf_blank_set/13485/Initial Certification /Stage 2/FR.232-1_MD-QMS Audit Report R01&09.10.2025.docx
+++ b/backend/uaf_blank_set/13485/Initial Certification /Stage 2/FR.232-1_MD-QMS Audit Report R01&09.10.2025.docx
@@ -7746,6 +7746,115 @@
               <w:t>Change of Address</w:t>
             </w:r>
           </w:p>
+        </w:tc>
+      </w:tr>
+      <w:tr>
+        <w:trPr>
+          <w:trHeight w:val="215"/>
+        </w:trPr>
+        <w:tc>
+          <w:tcPr>
+            <w:tcW w:w="1305" w:type="dxa"/>
+          </w:tcPr>
+          <w:p/>
+        </w:tc>
+        <w:tc>
+          <w:tcPr>
+            <w:tcW w:w="13449" w:type="dxa"/>
+          </w:tcPr>
+          <w:p/>
+        </w:tc>
+      </w:tr>
+      <w:tr>
+        <w:trPr>
+          <w:trHeight w:val="215"/>
+        </w:trPr>
+        <w:tc>
+          <w:tcPr>
+            <w:tcW w:w="1305" w:type="dxa"/>
+          </w:tcPr>
+          <w:p>
+            <w:r>
+              <w:rPr>
+                <w:rFonts w:ascii="Times New Roman" w:hAnsi="Times New Roman"/>
+                <w:sz w:val="18"/>
+              </w:rPr>
+              <w:t xml:space="preserve">Lead Auditor</w:t>
+            </w:r>
+          </w:p>
+        </w:tc>
+        <w:tc>
+          <w:tcPr>
+            <w:tcW w:w="13449" w:type="dxa"/>
+          </w:tcPr>
+          <w:p/>
+        </w:tc>
+      </w:tr>
+      <w:tr>
+        <w:trPr>
+          <w:trHeight w:val="215"/>
+        </w:trPr>
+        <w:tc>
+          <w:tcPr>
+            <w:tcW w:w="1305" w:type="dxa"/>
+          </w:tcPr>
+          <w:p/>
+        </w:tc>
+        <w:tc>
+          <w:tcPr>
+            <w:tcW w:w="13449" w:type="dxa"/>
+          </w:tcPr>
+          <w:p/>
+        </w:tc>
+      </w:tr>
+      <w:tr>
+        <w:trPr>
+          <w:trHeight w:val="215"/>
+        </w:trPr>
+        <w:tc>
+          <w:tcPr>
+            <w:tcW w:w="1305" w:type="dxa"/>
+          </w:tcPr>
+          <w:p>
+            <w:r>
+              <w:rPr>
+                <w:rFonts w:ascii="Times New Roman" w:hAnsi="Times New Roman"/>
+                <w:sz w:val="18"/>
+              </w:rPr>
+              <w:t>Signature</w:t>
+            </w:r>
+          </w:p>
+        </w:tc>
+        <w:tc>
+          <w:tcPr>
+            <w:tcW w:w="13449" w:type="dxa"/>
+          </w:tcPr>
+          <w:p/>
+        </w:tc>
+      </w:tr>
+      <w:tr>
+        <w:trPr>
+          <w:trHeight w:val="215"/>
+        </w:trPr>
+        <w:tc>
+          <w:tcPr>
+            <w:tcW w:w="1305" w:type="dxa"/>
+          </w:tcPr>
+          <w:p>
+            <w:r>
+              <w:rPr>
+                <w:rFonts w:ascii="Times New Roman" w:hAnsi="Times New Roman"/>
+                <w:sz w:val="18"/>
+              </w:rPr>
+              <w:t>[SIG:LEAD_AUDITOR]</w:t>
+            </w:r>
+          </w:p>
+        </w:tc>
+        <w:tc>
+          <w:tcPr>
+            <w:tcW w:w="13449" w:type="dxa"/>
+          </w:tcPr>
+          <w:p/>
         </w:tc>
       </w:tr>
     </w:tbl>
@@ -34332,7 +34441,6 @@
                 <w:sz w:val="20"/>
                 <w:lang w:val="en-US"/>
               </w:rPr>
-              <w:t>Lead Auditor</w:t>
             </w:r>
           </w:p>
         </w:tc>
@@ -34427,7 +34535,6 @@
                 <w:sz w:val="20"/>
                 <w:lang w:val="en-US"/>
               </w:rPr>
-              <w:t>Signature</w:t>
             </w:r>
           </w:p>
         </w:tc>
@@ -34483,7 +34590,6 @@
                 <w:color w:val="B4B4B4"/>
                 <w:sz w:val="16"/>
               </w:rPr>
-              <w:t>[SIG:LEAD_AUDITOR]</w:t>
             </w:r>
           </w:p>
         </w:tc>

</xml_diff>

<commit_message>
feat: add MDQMS stage 2 report workflow
</commit_message>
<xml_diff>
--- a/backend/uaf_blank_set/13485/Initial Certification /Stage 2/FR.232-1_MD-QMS Audit Report R01&09.10.2025.docx
+++ b/backend/uaf_blank_set/13485/Initial Certification /Stage 2/FR.232-1_MD-QMS Audit Report R01&09.10.2025.docx
@@ -277,58 +277,14 @@
               <w:rPr>
                 <w:rFonts w:ascii="Times New Roman" w:hAnsi="Times New Roman"/>
                 <w:bCs/>
-                <w:sz w:val="20"/>
-                <w:lang w:val="en-US"/>
-              </w:rPr>
-            </w:pPr>
-            <w:r>
-              <w:rPr>
-                <w:rFonts w:ascii="Times New Roman" w:hAnsi="Times New Roman"/>
-                <w:bCs/>
-                <w:sz w:val="20"/>
-                <w:lang w:val="en-US"/>
-              </w:rPr>
+                <w:lang w:val="en-GB"/>
+              </w:rPr>
+            </w:pPr>
+            <w:r>
               <w:t>{{ company_name }}</w:t>
-            </w:r>
-          </w:p>
-          <w:p>
-            <w:pPr>
-              <w:shd w:val="clear" w:color="auto" w:fill="FFFFFF"/>
-              <w:jc w:val="center"/>
-              <w:rPr>
-                <w:rFonts w:ascii="Times New Roman" w:hAnsi="Times New Roman"/>
-                <w:bCs/>
-                <w:sz w:val="20"/>
-                <w:lang w:val="en-US"/>
-              </w:rPr>
-            </w:pPr>
-            <w:r>
-              <w:rPr>
-                <w:rFonts w:ascii="Times New Roman" w:hAnsi="Times New Roman"/>
-                <w:bCs/>
-                <w:sz w:val="20"/>
-                <w:lang w:val="en-US"/>
-              </w:rPr>
+              <w:br/>
               <w:t>{{ company_address }}</w:t>
-            </w:r>
-          </w:p>
-          <w:p>
-            <w:pPr>
-              <w:shd w:val="clear" w:color="auto" w:fill="FFFFFF"/>
-              <w:jc w:val="center"/>
-              <w:rPr>
-                <w:rFonts w:ascii="Times New Roman" w:hAnsi="Times New Roman"/>
-                <w:bCs/>
-                <w:lang w:val="en-GB"/>
-              </w:rPr>
-            </w:pPr>
-            <w:r>
-              <w:rPr>
-                <w:rFonts w:ascii="Times New Roman" w:hAnsi="Times New Roman"/>
-                <w:bCs/>
-                <w:sz w:val="20"/>
-                <w:lang w:val="en-US"/>
-              </w:rPr>
+              <w:br/>
               <w:t>Tel: {{ phone }} | E-mail: {{ email }}</w:t>
             </w:r>
           </w:p>
@@ -425,10 +381,6 @@
               </w:rPr>
             </w:pPr>
             <w:r>
-              <w:rPr>
-                <w:rFonts w:ascii="Times New Roman" w:hAnsi="Times New Roman"/>
-                <w:sz w:val="20"/>
-              </w:rPr>
               <w:t>{{ scope_en }}</w:t>
             </w:r>
           </w:p>
@@ -501,7 +453,6 @@
                 <w:sz w:val="20"/>
                 <w:lang w:val="en-US"/>
               </w:rPr>
-              <w:lastRenderedPageBreak/>
               <w:t>Device class</w:t>
             </w:r>
           </w:p>
@@ -1052,7 +1003,7 @@
     </w:p>
     <w:tbl>
       <w:tblPr>
-        <w:tblW w:w="26390" w:type="dxa"/>
+        <w:tblW w:w="14754" w:type="dxa"/>
         <w:tblInd w:w="-5" w:type="dxa"/>
         <w:tblBorders>
           <w:top w:val="single" w:sz="4" w:space="0" w:color="auto"/>
@@ -1071,7 +1022,6 @@
       <w:tblGrid>
         <w:gridCol w:w="3118"/>
         <w:gridCol w:w="11636"/>
-        <w:gridCol w:w="11636"/>
       </w:tblGrid>
       <w:tr>
         <w:trPr>
@@ -1128,34 +1078,8 @@
               </w:rPr>
             </w:pPr>
             <w:r>
-              <w:rPr>
-                <w:rStyle w:val="HTMLCode"/>
-                <w:rFonts w:ascii="Times New Roman" w:eastAsia="Calibri" w:hAnsi="Times New Roman" w:cs="Times New Roman"/>
-              </w:rPr>
               <w:t>{{ plan_number }}</w:t>
             </w:r>
-          </w:p>
-        </w:tc>
-        <w:tc>
-          <w:tcPr>
-            <w:tcW w:w="11636" w:type="dxa"/>
-            <w:tcBorders>
-              <w:top w:val="single" w:sz="4" w:space="0" w:color="auto"/>
-              <w:left w:val="single" w:sz="4" w:space="0" w:color="auto"/>
-              <w:bottom w:val="single" w:sz="4" w:space="0" w:color="auto"/>
-              <w:right w:val="single" w:sz="4" w:space="0" w:color="auto"/>
-            </w:tcBorders>
-            <w:vAlign w:val="center"/>
-          </w:tcPr>
-          <w:p>
-            <w:pPr>
-              <w:shd w:val="clear" w:color="auto" w:fill="FFFFFF"/>
-              <w:rPr>
-                <w:rFonts w:ascii="Times New Roman" w:hAnsi="Times New Roman"/>
-                <w:sz w:val="20"/>
-                <w:lang w:val="en-GB"/>
-              </w:rPr>
-            </w:pPr>
           </w:p>
         </w:tc>
       </w:tr>
@@ -1214,34 +1138,8 @@
               </w:rPr>
             </w:pPr>
             <w:r>
-              <w:rPr>
-                <w:rFonts w:ascii="Times New Roman" w:hAnsi="Times New Roman"/>
-                <w:sz w:val="20"/>
-              </w:rPr>
               <w:t>{{ report_date }}</w:t>
             </w:r>
-          </w:p>
-        </w:tc>
-        <w:tc>
-          <w:tcPr>
-            <w:tcW w:w="11636" w:type="dxa"/>
-            <w:tcBorders>
-              <w:top w:val="single" w:sz="4" w:space="0" w:color="auto"/>
-              <w:left w:val="single" w:sz="4" w:space="0" w:color="auto"/>
-              <w:bottom w:val="single" w:sz="4" w:space="0" w:color="auto"/>
-              <w:right w:val="single" w:sz="4" w:space="0" w:color="auto"/>
-            </w:tcBorders>
-            <w:vAlign w:val="center"/>
-          </w:tcPr>
-          <w:p>
-            <w:pPr>
-              <w:shd w:val="clear" w:color="auto" w:fill="FFFFFF"/>
-              <w:rPr>
-                <w:rFonts w:ascii="Times New Roman" w:hAnsi="Times New Roman"/>
-                <w:sz w:val="20"/>
-                <w:lang w:val="en-GB"/>
-              </w:rPr>
-            </w:pPr>
           </w:p>
         </w:tc>
       </w:tr>
@@ -1300,34 +1198,8 @@
               </w:rPr>
             </w:pPr>
             <w:r>
-              <w:rPr>
-                <w:rStyle w:val="HTMLCode"/>
-                <w:rFonts w:ascii="Times New Roman" w:eastAsia="Calibri" w:hAnsi="Times New Roman" w:cs="Times New Roman"/>
-              </w:rPr>
               <w:t>{{ standards_str }}</w:t>
             </w:r>
-          </w:p>
-        </w:tc>
-        <w:tc>
-          <w:tcPr>
-            <w:tcW w:w="11636" w:type="dxa"/>
-            <w:tcBorders>
-              <w:top w:val="single" w:sz="4" w:space="0" w:color="auto"/>
-              <w:left w:val="single" w:sz="4" w:space="0" w:color="auto"/>
-              <w:bottom w:val="single" w:sz="4" w:space="0" w:color="auto"/>
-              <w:right w:val="single" w:sz="4" w:space="0" w:color="auto"/>
-            </w:tcBorders>
-            <w:vAlign w:val="center"/>
-          </w:tcPr>
-          <w:p>
-            <w:pPr>
-              <w:shd w:val="clear" w:color="auto" w:fill="FFFFFF"/>
-              <w:rPr>
-                <w:rFonts w:ascii="Times New Roman" w:hAnsi="Times New Roman"/>
-                <w:sz w:val="20"/>
-                <w:lang w:val="en-GB"/>
-              </w:rPr>
-            </w:pPr>
           </w:p>
         </w:tc>
       </w:tr>
@@ -1386,34 +1258,8 @@
               </w:rPr>
             </w:pPr>
             <w:r>
-              <w:rPr>
-                <w:rStyle w:val="HTMLCode"/>
-                <w:rFonts w:ascii="Times New Roman" w:eastAsia="Calibri" w:hAnsi="Times New Roman" w:cs="Times New Roman"/>
-              </w:rPr>
               <w:t>{{ lead_auditor_name }}</w:t>
             </w:r>
-          </w:p>
-        </w:tc>
-        <w:tc>
-          <w:tcPr>
-            <w:tcW w:w="11636" w:type="dxa"/>
-            <w:tcBorders>
-              <w:top w:val="single" w:sz="4" w:space="0" w:color="auto"/>
-              <w:left w:val="single" w:sz="4" w:space="0" w:color="auto"/>
-              <w:bottom w:val="single" w:sz="4" w:space="0" w:color="auto"/>
-              <w:right w:val="single" w:sz="4" w:space="0" w:color="auto"/>
-            </w:tcBorders>
-            <w:vAlign w:val="center"/>
-          </w:tcPr>
-          <w:p>
-            <w:pPr>
-              <w:shd w:val="clear" w:color="auto" w:fill="FFFFFF"/>
-              <w:rPr>
-                <w:rFonts w:ascii="Times New Roman" w:hAnsi="Times New Roman"/>
-                <w:sz w:val="20"/>
-                <w:lang w:val="en-GB"/>
-              </w:rPr>
-            </w:pPr>
           </w:p>
         </w:tc>
       </w:tr>
@@ -1472,34 +1318,8 @@
               </w:rPr>
             </w:pPr>
             <w:r>
-              <w:rPr>
-                <w:rStyle w:val="HTMLCode"/>
-                <w:rFonts w:ascii="Times New Roman" w:eastAsia="Calibri" w:hAnsi="Times New Roman" w:cs="Times New Roman"/>
-              </w:rPr>
               <w:t>{{ auditors[0].name if auditors|length &gt; 0 else "" }}</w:t>
             </w:r>
-          </w:p>
-        </w:tc>
-        <w:tc>
-          <w:tcPr>
-            <w:tcW w:w="11636" w:type="dxa"/>
-            <w:tcBorders>
-              <w:top w:val="single" w:sz="4" w:space="0" w:color="auto"/>
-              <w:left w:val="single" w:sz="4" w:space="0" w:color="auto"/>
-              <w:bottom w:val="single" w:sz="4" w:space="0" w:color="auto"/>
-              <w:right w:val="single" w:sz="4" w:space="0" w:color="auto"/>
-            </w:tcBorders>
-            <w:vAlign w:val="center"/>
-          </w:tcPr>
-          <w:p>
-            <w:pPr>
-              <w:shd w:val="clear" w:color="auto" w:fill="FFFFFF"/>
-              <w:rPr>
-                <w:rFonts w:ascii="Times New Roman" w:hAnsi="Times New Roman"/>
-                <w:sz w:val="20"/>
-                <w:lang w:val="en-GB"/>
-              </w:rPr>
-            </w:pPr>
           </w:p>
         </w:tc>
       </w:tr>
@@ -1558,34 +1378,8 @@
               </w:rPr>
             </w:pPr>
             <w:r>
-              <w:rPr>
-                <w:rFonts w:ascii="Times New Roman" w:hAnsi="Times New Roman"/>
-                <w:sz w:val="20"/>
-              </w:rPr>
               <w:t>{{ auditors[1].name if auditors|length &gt; 1 else "" }}</w:t>
             </w:r>
-          </w:p>
-        </w:tc>
-        <w:tc>
-          <w:tcPr>
-            <w:tcW w:w="11636" w:type="dxa"/>
-            <w:tcBorders>
-              <w:top w:val="single" w:sz="4" w:space="0" w:color="auto"/>
-              <w:left w:val="single" w:sz="4" w:space="0" w:color="auto"/>
-              <w:bottom w:val="single" w:sz="4" w:space="0" w:color="auto"/>
-              <w:right w:val="single" w:sz="4" w:space="0" w:color="auto"/>
-            </w:tcBorders>
-            <w:vAlign w:val="center"/>
-          </w:tcPr>
-          <w:p>
-            <w:pPr>
-              <w:shd w:val="clear" w:color="auto" w:fill="FFFFFF"/>
-              <w:rPr>
-                <w:rFonts w:ascii="Times New Roman" w:hAnsi="Times New Roman"/>
-                <w:sz w:val="20"/>
-                <w:lang w:val="en-GB"/>
-              </w:rPr>
-            </w:pPr>
           </w:p>
         </w:tc>
       </w:tr>
@@ -1644,34 +1438,8 @@
               </w:rPr>
             </w:pPr>
             <w:r>
-              <w:rPr>
-                <w:rFonts w:ascii="Times New Roman" w:hAnsi="Times New Roman"/>
-                <w:sz w:val="20"/>
-              </w:rPr>
               <w:t>{{ technical_experts[0].name if technical_experts|length &gt; 0 else "" }}</w:t>
             </w:r>
-          </w:p>
-        </w:tc>
-        <w:tc>
-          <w:tcPr>
-            <w:tcW w:w="11636" w:type="dxa"/>
-            <w:tcBorders>
-              <w:top w:val="single" w:sz="4" w:space="0" w:color="auto"/>
-              <w:left w:val="single" w:sz="4" w:space="0" w:color="auto"/>
-              <w:bottom w:val="single" w:sz="4" w:space="0" w:color="auto"/>
-              <w:right w:val="single" w:sz="4" w:space="0" w:color="auto"/>
-            </w:tcBorders>
-            <w:vAlign w:val="center"/>
-          </w:tcPr>
-          <w:p>
-            <w:pPr>
-              <w:shd w:val="clear" w:color="auto" w:fill="FFFFFF"/>
-              <w:rPr>
-                <w:rFonts w:ascii="Times New Roman" w:hAnsi="Times New Roman"/>
-                <w:sz w:val="20"/>
-                <w:lang w:val="en-GB"/>
-              </w:rPr>
-            </w:pPr>
           </w:p>
         </w:tc>
       </w:tr>
@@ -1729,28 +1497,9 @@
                 <w:lang w:val="en-GB"/>
               </w:rPr>
             </w:pPr>
-          </w:p>
-        </w:tc>
-        <w:tc>
-          <w:tcPr>
-            <w:tcW w:w="11636" w:type="dxa"/>
-            <w:tcBorders>
-              <w:top w:val="single" w:sz="4" w:space="0" w:color="auto"/>
-              <w:left w:val="single" w:sz="4" w:space="0" w:color="auto"/>
-              <w:bottom w:val="single" w:sz="4" w:space="0" w:color="auto"/>
-              <w:right w:val="single" w:sz="4" w:space="0" w:color="auto"/>
-            </w:tcBorders>
-            <w:vAlign w:val="center"/>
-          </w:tcPr>
-          <w:p>
-            <w:pPr>
-              <w:shd w:val="clear" w:color="auto" w:fill="FFFFFF"/>
-              <w:rPr>
-                <w:rFonts w:ascii="Times New Roman" w:hAnsi="Times New Roman"/>
-                <w:sz w:val="20"/>
-                <w:lang w:val="en-GB"/>
-              </w:rPr>
-            </w:pPr>
+            <w:r>
+              <w:t>{{ trainees[0].name if trainees|length &gt; 0 else "" }}</w:t>
+            </w:r>
           </w:p>
         </w:tc>
       </w:tr>
@@ -1808,28 +1557,9 @@
                 <w:lang w:val="en-GB"/>
               </w:rPr>
             </w:pPr>
-          </w:p>
-        </w:tc>
-        <w:tc>
-          <w:tcPr>
-            <w:tcW w:w="11636" w:type="dxa"/>
-            <w:tcBorders>
-              <w:top w:val="single" w:sz="4" w:space="0" w:color="auto"/>
-              <w:left w:val="single" w:sz="4" w:space="0" w:color="auto"/>
-              <w:bottom w:val="single" w:sz="4" w:space="0" w:color="auto"/>
-              <w:right w:val="single" w:sz="4" w:space="0" w:color="auto"/>
-            </w:tcBorders>
-            <w:vAlign w:val="center"/>
-          </w:tcPr>
-          <w:p>
-            <w:pPr>
-              <w:shd w:val="clear" w:color="auto" w:fill="FFFFFF"/>
-              <w:rPr>
-                <w:rFonts w:ascii="Times New Roman" w:hAnsi="Times New Roman"/>
-                <w:sz w:val="20"/>
-                <w:lang w:val="en-GB"/>
-              </w:rPr>
-            </w:pPr>
+            <w:r>
+              <w:t>{{ evaluators[0].name if evaluators|length &gt; 0 else "" }}</w:t>
+            </w:r>
           </w:p>
         </w:tc>
       </w:tr>
@@ -1888,34 +1618,8 @@
               </w:rPr>
             </w:pPr>
             <w:r>
-              <w:rPr>
-                <w:rStyle w:val="HTMLCode"/>
-                <w:rFonts w:ascii="Times New Roman" w:eastAsia="Calibri" w:hAnsi="Times New Roman" w:cs="Times New Roman"/>
-              </w:rPr>
               <w:t>{{ observers[0].name if observers|length &gt; 0 else "" }}</w:t>
             </w:r>
-          </w:p>
-        </w:tc>
-        <w:tc>
-          <w:tcPr>
-            <w:tcW w:w="11636" w:type="dxa"/>
-            <w:tcBorders>
-              <w:top w:val="single" w:sz="4" w:space="0" w:color="auto"/>
-              <w:left w:val="single" w:sz="4" w:space="0" w:color="auto"/>
-              <w:bottom w:val="single" w:sz="4" w:space="0" w:color="auto"/>
-              <w:right w:val="single" w:sz="4" w:space="0" w:color="auto"/>
-            </w:tcBorders>
-            <w:vAlign w:val="center"/>
-          </w:tcPr>
-          <w:p>
-            <w:pPr>
-              <w:shd w:val="clear" w:color="auto" w:fill="FFFFFF"/>
-              <w:rPr>
-                <w:rFonts w:ascii="Times New Roman" w:hAnsi="Times New Roman"/>
-                <w:sz w:val="20"/>
-                <w:lang w:val="en-GB"/>
-              </w:rPr>
-            </w:pPr>
           </w:p>
         </w:tc>
       </w:tr>
@@ -1974,34 +1678,8 @@
               </w:rPr>
             </w:pPr>
             <w:r>
-              <w:rPr>
-                <w:rFonts w:ascii="Times New Roman" w:hAnsi="Times New Roman"/>
-                <w:sz w:val="20"/>
-              </w:rPr>
               <w:t>{{ representative }}</w:t>
             </w:r>
-          </w:p>
-        </w:tc>
-        <w:tc>
-          <w:tcPr>
-            <w:tcW w:w="11636" w:type="dxa"/>
-            <w:tcBorders>
-              <w:top w:val="single" w:sz="4" w:space="0" w:color="auto"/>
-              <w:left w:val="single" w:sz="4" w:space="0" w:color="auto"/>
-              <w:bottom w:val="single" w:sz="4" w:space="0" w:color="auto"/>
-              <w:right w:val="single" w:sz="4" w:space="0" w:color="auto"/>
-            </w:tcBorders>
-            <w:vAlign w:val="center"/>
-          </w:tcPr>
-          <w:p>
-            <w:pPr>
-              <w:shd w:val="clear" w:color="auto" w:fill="FFFFFF"/>
-              <w:rPr>
-                <w:rFonts w:ascii="Times New Roman" w:hAnsi="Times New Roman"/>
-                <w:sz w:val="20"/>
-                <w:lang w:val="en-GB"/>
-              </w:rPr>
-            </w:pPr>
           </w:p>
         </w:tc>
       </w:tr>
@@ -2095,10 +1773,6 @@
               </w:rPr>
             </w:pPr>
             <w:r>
-              <w:rPr>
-                <w:rStyle w:val="HTMLCode"/>
-                <w:rFonts w:ascii="Times New Roman" w:eastAsia="Calibri" w:hAnsi="Times New Roman" w:cs="Times New Roman"/>
-              </w:rPr>
               <w:t>{{ audit_dates }}</w:t>
             </w:r>
           </w:p>
@@ -2141,10 +1815,6 @@
               </w:rPr>
             </w:pPr>
             <w:r>
-              <w:rPr>
-                <w:rStyle w:val="HTMLCode"/>
-                <w:rFonts w:ascii="Times New Roman" w:eastAsia="Calibri" w:hAnsi="Times New Roman" w:cs="Times New Roman"/>
-              </w:rPr>
               <w:t>{{ audit_days }}</w:t>
             </w:r>
           </w:p>
@@ -2220,7 +1890,7 @@
               </w:rPr>
             </w:pPr>
             <w:r>
-              <w:t xml:space="preserve">{{ "☑" if is_initial else "☐" }} Initial Certification  {{ "☑" if is_surveillance else "☐" }} Surveillance  {{ "☑" if is_recertification else "☐" }} Recertification  {{ "☑" if is_special else "☐" }} Special</w:t>
+              <w:t>{{ "☑" if is_initial else "☐" }} Initial Certification  {{ "☑" if is_surveillance else "☐" }} Surveillance  {{ "☑" if is_recertification else "☐" }} Recertification  {{ "☑" if is_special else "☐" }} Special</w:t>
             </w:r>
           </w:p>
         </w:tc>
@@ -2584,11 +2254,7 @@
               </w:rPr>
             </w:pPr>
             <w:r>
-              <w:rPr>
-                <w:rFonts w:ascii="Times New Roman" w:hAnsi="Times New Roman"/>
-                <w:sz w:val="20"/>
-              </w:rPr>
-              <w:t>{{ sites[0].address if sites else "" }}</w:t>
+              <w:t>{{ sites[0].address if sites|length &gt; 0 else "" }}</w:t>
             </w:r>
           </w:p>
         </w:tc>
@@ -2610,12 +2276,7 @@
               </w:rPr>
             </w:pPr>
             <w:r>
-              <w:rPr>
-                <w:rFonts w:ascii="Times New Roman" w:hAnsi="Times New Roman"/>
-                <w:sz w:val="20"/>
-                <w:lang w:val="en-US"/>
-              </w:rPr>
-              <w:t>{{ audit_dates }}</w:t>
+              <w:t>{{ audit_dates if sites|length &gt; 0 else "" }}</w:t>
             </w:r>
           </w:p>
         </w:tc>
@@ -2638,9 +2299,6 @@
                 <w:lang w:val="en-GB"/>
               </w:rPr>
             </w:pPr>
-            <w:r>
-              <w:t xml:space="preserve">{%tr if sites|length &gt; 1 %}</w:t>
-            </w:r>
           </w:p>
         </w:tc>
         <w:tc>
@@ -2661,6 +2319,9 @@
                 <w:lang w:val="en-GB"/>
               </w:rPr>
             </w:pPr>
+            <w:r>
+              <w:t>{{ sites[1].address if sites|length &gt; 1 else "" }}</w:t>
+            </w:r>
           </w:p>
         </w:tc>
         <w:tc>
@@ -2681,6 +2342,9 @@
                 <w:lang w:val="en-GB"/>
               </w:rPr>
             </w:pPr>
+            <w:r>
+              <w:t>{{ audit_dates if sites|length &gt; 1 else "" }}</w:t>
+            </w:r>
           </w:p>
         </w:tc>
       </w:tr>
@@ -2723,7 +2387,7 @@
               </w:rPr>
             </w:pPr>
             <w:r>
-              <w:t xml:space="preserve">{{ sites[1].address }}</w:t>
+              <w:t>{{ sites[2].address if sites|length &gt; 2 else "" }}</w:t>
             </w:r>
           </w:p>
         </w:tc>
@@ -2746,266 +2410,7 @@
               </w:rPr>
             </w:pPr>
             <w:r>
-              <w:t xml:space="preserve">{{ audit_dates }}</w:t>
-            </w:r>
-          </w:p>
-        </w:tc>
-      </w:tr>
-      <w:tr>
-        <w:trPr>
-          <w:trHeight w:val="397"/>
-        </w:trPr>
-        <w:tc>
-          <w:tcPr>
-            <w:tcW w:w="2466" w:type="dxa"/>
-            <w:vMerge/>
-            <w:vAlign w:val="center"/>
-          </w:tcPr>
-          <w:p>
-            <w:pPr>
-              <w:rPr>
-                <w:rFonts w:ascii="Times New Roman" w:hAnsi="Times New Roman"/>
-                <w:sz w:val="20"/>
-                <w:lang w:val="en-GB"/>
-              </w:rPr>
-            </w:pPr>
-          </w:p>
-        </w:tc>
-        <w:tc>
-          <w:tcPr>
-            <w:tcW w:w="5761" w:type="dxa"/>
-            <w:tcBorders>
-              <w:top w:val="single" w:sz="4" w:space="0" w:color="000000"/>
-              <w:bottom w:val="single" w:sz="4" w:space="0" w:color="000000"/>
-              <w:right w:val="single" w:sz="4" w:space="0" w:color="auto"/>
-            </w:tcBorders>
-            <w:vAlign w:val="center"/>
-          </w:tcPr>
-          <w:p>
-            <w:pPr>
-              <w:rPr>
-                <w:rFonts w:ascii="Times New Roman" w:hAnsi="Times New Roman"/>
-                <w:sz w:val="20"/>
-                <w:lang w:val="en-GB"/>
-              </w:rPr>
-            </w:pPr>
-          </w:p>
-        </w:tc>
-        <w:tc>
-          <w:tcPr>
-            <w:tcW w:w="6527" w:type="dxa"/>
-            <w:tcBorders>
-              <w:top w:val="single" w:sz="4" w:space="0" w:color="000000"/>
-              <w:left w:val="single" w:sz="4" w:space="0" w:color="auto"/>
-              <w:bottom w:val="single" w:sz="4" w:space="0" w:color="000000"/>
-            </w:tcBorders>
-            <w:vAlign w:val="center"/>
-          </w:tcPr>
-          <w:p>
-            <w:pPr>
-              <w:rPr>
-                <w:rFonts w:ascii="Times New Roman" w:hAnsi="Times New Roman"/>
-                <w:sz w:val="20"/>
-                <w:lang w:val="en-GB"/>
-              </w:rPr>
-            </w:pPr>
-            <w:r>
-              <w:t xml:space="preserve">{%tr endif %}</w:t>
-            </w:r>
-          </w:p>
-        </w:tc>
-      </w:tr>
-      <w:tr>
-        <w:trPr>
-          <w:trHeight w:val="397"/>
-        </w:trPr>
-        <w:tc>
-          <w:tcPr>
-            <w:tcW w:w="2466" w:type="dxa"/>
-            <w:vMerge/>
-            <w:vAlign w:val="center"/>
-          </w:tcPr>
-          <w:p>
-            <w:pPr>
-              <w:rPr>
-                <w:rFonts w:ascii="Times New Roman" w:hAnsi="Times New Roman"/>
-                <w:sz w:val="20"/>
-                <w:lang w:val="en-GB"/>
-              </w:rPr>
-            </w:pPr>
-            <w:r>
-              <w:t xml:space="preserve">{%tr if sites|length &gt; 2 %}</w:t>
-            </w:r>
-          </w:p>
-        </w:tc>
-        <w:tc>
-          <w:tcPr>
-            <w:tcW w:w="5761" w:type="dxa"/>
-            <w:tcBorders>
-              <w:top w:val="single" w:sz="4" w:space="0" w:color="000000"/>
-              <w:bottom w:val="single" w:sz="4" w:space="0" w:color="000000"/>
-              <w:right w:val="single" w:sz="4" w:space="0" w:color="auto"/>
-            </w:tcBorders>
-            <w:vAlign w:val="center"/>
-          </w:tcPr>
-          <w:p>
-            <w:pPr>
-              <w:rPr>
-                <w:rFonts w:ascii="Times New Roman" w:hAnsi="Times New Roman"/>
-                <w:sz w:val="20"/>
-                <w:lang w:val="en-GB"/>
-              </w:rPr>
-            </w:pPr>
-          </w:p>
-        </w:tc>
-        <w:tc>
-          <w:tcPr>
-            <w:tcW w:w="6527" w:type="dxa"/>
-            <w:tcBorders>
-              <w:top w:val="single" w:sz="4" w:space="0" w:color="000000"/>
-              <w:left w:val="single" w:sz="4" w:space="0" w:color="auto"/>
-              <w:bottom w:val="single" w:sz="4" w:space="0" w:color="000000"/>
-            </w:tcBorders>
-            <w:vAlign w:val="center"/>
-          </w:tcPr>
-          <w:p>
-            <w:pPr>
-              <w:rPr>
-                <w:rFonts w:ascii="Times New Roman" w:hAnsi="Times New Roman"/>
-                <w:sz w:val="20"/>
-                <w:lang w:val="en-GB"/>
-              </w:rPr>
-            </w:pPr>
-          </w:p>
-        </w:tc>
-      </w:tr>
-      <w:tr>
-        <w:trPr>
-          <w:trHeight w:val="397"/>
-        </w:trPr>
-        <w:tc>
-          <w:tcPr>
-            <w:tcW w:w="2466" w:type="dxa"/>
-            <w:vMerge/>
-            <w:vAlign w:val="center"/>
-          </w:tcPr>
-          <w:p>
-            <w:pPr>
-              <w:rPr>
-                <w:rFonts w:ascii="Times New Roman" w:hAnsi="Times New Roman"/>
-                <w:sz w:val="20"/>
-                <w:lang w:val="en-GB"/>
-              </w:rPr>
-            </w:pPr>
-          </w:p>
-        </w:tc>
-        <w:tc>
-          <w:tcPr>
-            <w:tcW w:w="5761" w:type="dxa"/>
-            <w:tcBorders>
-              <w:top w:val="single" w:sz="4" w:space="0" w:color="000000"/>
-              <w:bottom w:val="single" w:sz="4" w:space="0" w:color="000000"/>
-              <w:right w:val="single" w:sz="4" w:space="0" w:color="auto"/>
-            </w:tcBorders>
-            <w:vAlign w:val="center"/>
-          </w:tcPr>
-          <w:p>
-            <w:pPr>
-              <w:rPr>
-                <w:rFonts w:ascii="Times New Roman" w:hAnsi="Times New Roman"/>
-                <w:sz w:val="20"/>
-                <w:lang w:val="en-GB"/>
-              </w:rPr>
-            </w:pPr>
-            <w:r>
-              <w:t xml:space="preserve">{{ sites[2].address }}</w:t>
-            </w:r>
-          </w:p>
-        </w:tc>
-        <w:tc>
-          <w:tcPr>
-            <w:tcW w:w="6527" w:type="dxa"/>
-            <w:tcBorders>
-              <w:top w:val="single" w:sz="4" w:space="0" w:color="000000"/>
-              <w:left w:val="single" w:sz="4" w:space="0" w:color="auto"/>
-              <w:bottom w:val="single" w:sz="4" w:space="0" w:color="000000"/>
-            </w:tcBorders>
-            <w:vAlign w:val="center"/>
-          </w:tcPr>
-          <w:p>
-            <w:pPr>
-              <w:rPr>
-                <w:rFonts w:ascii="Times New Roman" w:hAnsi="Times New Roman"/>
-                <w:sz w:val="20"/>
-                <w:lang w:val="en-GB"/>
-              </w:rPr>
-            </w:pPr>
-            <w:r>
-              <w:t xml:space="preserve">{{ audit_dates }}</w:t>
-            </w:r>
-          </w:p>
-        </w:tc>
-      </w:tr>
-      <w:tr>
-        <w:trPr>
-          <w:trHeight w:val="397"/>
-        </w:trPr>
-        <w:tc>
-          <w:tcPr>
-            <w:tcW w:w="2466" w:type="dxa"/>
-            <w:vMerge/>
-            <w:vAlign w:val="center"/>
-          </w:tcPr>
-          <w:p>
-            <w:pPr>
-              <w:rPr>
-                <w:rFonts w:ascii="Times New Roman" w:hAnsi="Times New Roman"/>
-                <w:sz w:val="20"/>
-                <w:lang w:val="en-GB"/>
-              </w:rPr>
-            </w:pPr>
-          </w:p>
-        </w:tc>
-        <w:tc>
-          <w:tcPr>
-            <w:tcW w:w="5761" w:type="dxa"/>
-            <w:tcBorders>
-              <w:top w:val="single" w:sz="4" w:space="0" w:color="000000"/>
-              <w:bottom w:val="single" w:sz="4" w:space="0" w:color="000000"/>
-              <w:right w:val="single" w:sz="4" w:space="0" w:color="auto"/>
-            </w:tcBorders>
-            <w:vAlign w:val="center"/>
-          </w:tcPr>
-          <w:p>
-            <w:pPr>
-              <w:rPr>
-                <w:rFonts w:ascii="Times New Roman" w:hAnsi="Times New Roman"/>
-                <w:sz w:val="20"/>
-                <w:lang w:val="en-GB"/>
-              </w:rPr>
-            </w:pPr>
-          </w:p>
-        </w:tc>
-        <w:tc>
-          <w:tcPr>
-            <w:tcW w:w="6527" w:type="dxa"/>
-            <w:tcBorders>
-              <w:top w:val="single" w:sz="4" w:space="0" w:color="000000"/>
-              <w:left w:val="single" w:sz="4" w:space="0" w:color="auto"/>
-              <w:bottom w:val="single" w:sz="4" w:space="0" w:color="000000"/>
-            </w:tcBorders>
-            <w:vAlign w:val="center"/>
-          </w:tcPr>
-          <w:p>
-            <w:pPr>
-              <w:rPr>
-                <w:rFonts w:ascii="Times New Roman" w:hAnsi="Times New Roman"/>
-                <w:sz w:val="20"/>
-                <w:lang w:val="en-GB"/>
-              </w:rPr>
-            </w:pPr>
-            <w:r>
-              <w:t xml:space="preserve">{%tr endif %}</w:t>
+              <w:t>{{ audit_dates if sites|length &gt; 2 else "" }}</w:t>
             </w:r>
           </w:p>
         </w:tc>
@@ -3730,10 +3135,6 @@
               </w:rPr>
             </w:pPr>
             <w:r>
-              <w:rPr>
-                <w:rFonts w:ascii="Times New Roman" w:hAnsi="Times New Roman"/>
-                <w:sz w:val="20"/>
-              </w:rPr>
               <w:t>{{ total_employees }}</w:t>
             </w:r>
           </w:p>
@@ -3790,10 +3191,6 @@
               </w:rPr>
             </w:pPr>
             <w:r>
-              <w:rPr>
-                <w:rStyle w:val="HTMLCode"/>
-                <w:rFonts w:ascii="Times New Roman" w:eastAsia="Calibri" w:hAnsi="Times New Roman" w:cs="Times New Roman"/>
-              </w:rPr>
               <w:t>{{ subcontractors }}</w:t>
             </w:r>
           </w:p>
@@ -3850,10 +3247,6 @@
               </w:rPr>
             </w:pPr>
             <w:r>
-              <w:rPr>
-                <w:rStyle w:val="HTMLCode"/>
-                <w:rFonts w:ascii="Times New Roman" w:eastAsia="Calibri" w:hAnsi="Times New Roman" w:cs="Times New Roman"/>
-              </w:rPr>
               <w:t>{{ effective_employees }}</w:t>
             </w:r>
           </w:p>
@@ -5210,7 +4603,7 @@
           </w:tcPr>
           <w:p>
             <w:pPr>
-              <w:pStyle w:val="ListParagraph"/>
+              <w:pStyle w:val="ListeParagraf"/>
               <w:numPr>
                 <w:ilvl w:val="0"/>
                 <w:numId w:val="39"/>
@@ -5255,7 +4648,7 @@
           </w:tcPr>
           <w:p>
             <w:pPr>
-              <w:pStyle w:val="ListParagraph"/>
+              <w:pStyle w:val="ListeParagraf"/>
               <w:numPr>
                 <w:ilvl w:val="0"/>
                 <w:numId w:val="39"/>
@@ -5299,7 +4692,7 @@
           </w:tcPr>
           <w:p>
             <w:pPr>
-              <w:pStyle w:val="ListParagraph"/>
+              <w:pStyle w:val="ListeParagraf"/>
               <w:numPr>
                 <w:ilvl w:val="0"/>
                 <w:numId w:val="39"/>
@@ -5343,7 +4736,7 @@
           </w:tcPr>
           <w:p>
             <w:pPr>
-              <w:pStyle w:val="ListParagraph"/>
+              <w:pStyle w:val="ListeParagraf"/>
               <w:numPr>
                 <w:ilvl w:val="0"/>
                 <w:numId w:val="39"/>
@@ -5810,7 +5203,7 @@
           </w:tcPr>
           <w:p>
             <w:pPr>
-              <w:pStyle w:val="ListParagraph"/>
+              <w:pStyle w:val="ListeParagraf"/>
               <w:numPr>
                 <w:ilvl w:val="0"/>
                 <w:numId w:val="40"/>
@@ -5890,7 +5283,7 @@
           </w:tcPr>
           <w:p>
             <w:pPr>
-              <w:pStyle w:val="ListParagraph"/>
+              <w:pStyle w:val="ListeParagraf"/>
               <w:numPr>
                 <w:ilvl w:val="0"/>
                 <w:numId w:val="40"/>
@@ -5971,7 +5364,7 @@
           </w:tcPr>
           <w:p>
             <w:pPr>
-              <w:pStyle w:val="ListParagraph"/>
+              <w:pStyle w:val="ListeParagraf"/>
               <w:numPr>
                 <w:ilvl w:val="0"/>
                 <w:numId w:val="40"/>
@@ -6051,7 +5444,7 @@
           </w:tcPr>
           <w:p>
             <w:pPr>
-              <w:pStyle w:val="ListParagraph"/>
+              <w:pStyle w:val="ListeParagraf"/>
               <w:numPr>
                 <w:ilvl w:val="0"/>
                 <w:numId w:val="40"/>
@@ -7748,115 +7141,6 @@
           </w:p>
         </w:tc>
       </w:tr>
-      <w:tr>
-        <w:trPr>
-          <w:trHeight w:val="215"/>
-        </w:trPr>
-        <w:tc>
-          <w:tcPr>
-            <w:tcW w:w="1305" w:type="dxa"/>
-          </w:tcPr>
-          <w:p/>
-        </w:tc>
-        <w:tc>
-          <w:tcPr>
-            <w:tcW w:w="13449" w:type="dxa"/>
-          </w:tcPr>
-          <w:p/>
-        </w:tc>
-      </w:tr>
-      <w:tr>
-        <w:trPr>
-          <w:trHeight w:val="215"/>
-        </w:trPr>
-        <w:tc>
-          <w:tcPr>
-            <w:tcW w:w="1305" w:type="dxa"/>
-          </w:tcPr>
-          <w:p>
-            <w:r>
-              <w:rPr>
-                <w:rFonts w:ascii="Times New Roman" w:hAnsi="Times New Roman"/>
-                <w:sz w:val="18"/>
-              </w:rPr>
-              <w:t xml:space="preserve">Lead Auditor</w:t>
-            </w:r>
-          </w:p>
-        </w:tc>
-        <w:tc>
-          <w:tcPr>
-            <w:tcW w:w="13449" w:type="dxa"/>
-          </w:tcPr>
-          <w:p/>
-        </w:tc>
-      </w:tr>
-      <w:tr>
-        <w:trPr>
-          <w:trHeight w:val="215"/>
-        </w:trPr>
-        <w:tc>
-          <w:tcPr>
-            <w:tcW w:w="1305" w:type="dxa"/>
-          </w:tcPr>
-          <w:p/>
-        </w:tc>
-        <w:tc>
-          <w:tcPr>
-            <w:tcW w:w="13449" w:type="dxa"/>
-          </w:tcPr>
-          <w:p/>
-        </w:tc>
-      </w:tr>
-      <w:tr>
-        <w:trPr>
-          <w:trHeight w:val="215"/>
-        </w:trPr>
-        <w:tc>
-          <w:tcPr>
-            <w:tcW w:w="1305" w:type="dxa"/>
-          </w:tcPr>
-          <w:p>
-            <w:r>
-              <w:rPr>
-                <w:rFonts w:ascii="Times New Roman" w:hAnsi="Times New Roman"/>
-                <w:sz w:val="18"/>
-              </w:rPr>
-              <w:t>Signature</w:t>
-            </w:r>
-          </w:p>
-        </w:tc>
-        <w:tc>
-          <w:tcPr>
-            <w:tcW w:w="13449" w:type="dxa"/>
-          </w:tcPr>
-          <w:p/>
-        </w:tc>
-      </w:tr>
-      <w:tr>
-        <w:trPr>
-          <w:trHeight w:val="215"/>
-        </w:trPr>
-        <w:tc>
-          <w:tcPr>
-            <w:tcW w:w="1305" w:type="dxa"/>
-          </w:tcPr>
-          <w:p>
-            <w:r>
-              <w:rPr>
-                <w:rFonts w:ascii="Times New Roman" w:hAnsi="Times New Roman"/>
-                <w:sz w:val="18"/>
-              </w:rPr>
-              <w:t>[SIG:LEAD_AUDITOR]</w:t>
-            </w:r>
-          </w:p>
-        </w:tc>
-        <w:tc>
-          <w:tcPr>
-            <w:tcW w:w="13449" w:type="dxa"/>
-          </w:tcPr>
-          <w:p/>
-        </w:tc>
-      </w:tr>
     </w:tbl>
     <w:p>
       <w:pPr>
@@ -8439,6 +7723,7 @@
               </w:rPr>
               <w:t xml:space="preserve">the roles of the organization documented according to the applicable legal </w:t>
             </w:r>
+            <w:proofErr w:type="gramStart"/>
             <w:r>
               <w:rPr>
                 <w:rFonts w:ascii="Times New Roman" w:hAnsi="Times New Roman"/>
@@ -8447,6 +7732,7 @@
               </w:rPr>
               <w:t>requirements?</w:t>
             </w:r>
+            <w:proofErr w:type="gramEnd"/>
             <w:r>
               <w:rPr>
                 <w:rFonts w:ascii="Times New Roman" w:hAnsi="Times New Roman"/>
@@ -9256,7 +8542,7 @@
           </w:tcPr>
           <w:p>
             <w:pPr>
-              <w:pStyle w:val="ListParagraph"/>
+              <w:pStyle w:val="ListeParagraf"/>
               <w:numPr>
                 <w:ilvl w:val="0"/>
                 <w:numId w:val="20"/>
@@ -9326,7 +8612,7 @@
           </w:tcPr>
           <w:p>
             <w:pPr>
-              <w:pStyle w:val="ListParagraph"/>
+              <w:pStyle w:val="ListeParagraf"/>
               <w:numPr>
                 <w:ilvl w:val="0"/>
                 <w:numId w:val="20"/>
@@ -9396,7 +8682,7 @@
           </w:tcPr>
           <w:p>
             <w:pPr>
-              <w:pStyle w:val="ListParagraph"/>
+              <w:pStyle w:val="ListeParagraf"/>
               <w:numPr>
                 <w:ilvl w:val="0"/>
                 <w:numId w:val="20"/>
@@ -10915,7 +10201,7 @@
           </w:tcPr>
           <w:p>
             <w:pPr>
-              <w:pStyle w:val="ListParagraph"/>
+              <w:pStyle w:val="ListeParagraf"/>
               <w:numPr>
                 <w:ilvl w:val="0"/>
                 <w:numId w:val="21"/>
@@ -10987,7 +10273,7 @@
           </w:tcPr>
           <w:p>
             <w:pPr>
-              <w:pStyle w:val="ListParagraph"/>
+              <w:pStyle w:val="ListeParagraf"/>
               <w:numPr>
                 <w:ilvl w:val="0"/>
                 <w:numId w:val="21"/>
@@ -11059,7 +10345,7 @@
           </w:tcPr>
           <w:p>
             <w:pPr>
-              <w:pStyle w:val="ListParagraph"/>
+              <w:pStyle w:val="ListeParagraf"/>
               <w:numPr>
                 <w:ilvl w:val="0"/>
                 <w:numId w:val="21"/>
@@ -11131,7 +10417,7 @@
           </w:tcPr>
           <w:p>
             <w:pPr>
-              <w:pStyle w:val="ListParagraph"/>
+              <w:pStyle w:val="ListeParagraf"/>
               <w:numPr>
                 <w:ilvl w:val="0"/>
                 <w:numId w:val="21"/>
@@ -11203,7 +10489,7 @@
           </w:tcPr>
           <w:p>
             <w:pPr>
-              <w:pStyle w:val="ListParagraph"/>
+              <w:pStyle w:val="ListeParagraf"/>
               <w:numPr>
                 <w:ilvl w:val="0"/>
                 <w:numId w:val="21"/>
@@ -11283,7 +10569,7 @@
           </w:tcPr>
           <w:p>
             <w:pPr>
-              <w:pStyle w:val="ListParagraph"/>
+              <w:pStyle w:val="ListeParagraf"/>
               <w:numPr>
                 <w:ilvl w:val="0"/>
                 <w:numId w:val="21"/>
@@ -12099,6 +11385,7 @@
               </w:rPr>
               <w:t xml:space="preserve">the organization defined the retention period for at least one of the revoked </w:t>
             </w:r>
+            <w:proofErr w:type="gramStart"/>
             <w:r>
               <w:rPr>
                 <w:rFonts w:ascii="Times New Roman" w:hAnsi="Times New Roman"/>
@@ -12108,6 +11395,7 @@
               </w:rPr>
               <w:t>documents?</w:t>
             </w:r>
+            <w:proofErr w:type="gramEnd"/>
             <w:r>
               <w:rPr>
                 <w:rFonts w:ascii="Times New Roman" w:hAnsi="Times New Roman"/>
@@ -15532,7 +14820,25 @@
                 <w:szCs w:val="18"/>
               </w:rPr>
               <w:lastRenderedPageBreak/>
-              <w:t xml:space="preserve">document the processes necessary to establish competence, provide necessary training, and ensure staff </w:t>
+              <w:t xml:space="preserve">document the </w:t>
+            </w:r>
+            <w:proofErr w:type="gramStart"/>
+            <w:r>
+              <w:rPr>
+                <w:rFonts w:ascii="Times New Roman" w:hAnsi="Times New Roman"/>
+                <w:sz w:val="18"/>
+                <w:szCs w:val="18"/>
+              </w:rPr>
+              <w:t>processes necessary</w:t>
+            </w:r>
+            <w:proofErr w:type="gramEnd"/>
+            <w:r>
+              <w:rPr>
+                <w:rFonts w:ascii="Times New Roman" w:hAnsi="Times New Roman"/>
+                <w:sz w:val="18"/>
+                <w:szCs w:val="18"/>
+              </w:rPr>
+              <w:t xml:space="preserve"> to establish competence, provide necessary training, and ensure staff </w:t>
             </w:r>
             <w:r>
               <w:rPr>
@@ -16302,6 +15608,7 @@
               </w:rPr>
               <w:t xml:space="preserve">maintenance activities affecting product quality and requirements regarding the periodicity of maintenance activities </w:t>
             </w:r>
+            <w:proofErr w:type="gramStart"/>
             <w:r>
               <w:rPr>
                 <w:rFonts w:ascii="Times New Roman" w:hAnsi="Times New Roman"/>
@@ -16310,6 +15617,7 @@
               </w:rPr>
               <w:t>documented?</w:t>
             </w:r>
+            <w:proofErr w:type="gramEnd"/>
             <w:r>
               <w:rPr>
                 <w:rFonts w:ascii="Times New Roman" w:hAnsi="Times New Roman"/>
@@ -16594,7 +15902,25 @@
                 <w:sz w:val="18"/>
                 <w:szCs w:val="18"/>
               </w:rPr>
-              <w:t>If the work environment has a negative impact on product quality, are the work environment requirements documented and procedures established for monitoring and controlling the work environment?</w:t>
+              <w:t xml:space="preserve">If the work environment has a negative impact on product quality, are the work environment requirements </w:t>
+            </w:r>
+            <w:proofErr w:type="gramStart"/>
+            <w:r>
+              <w:rPr>
+                <w:rFonts w:ascii="Times New Roman" w:hAnsi="Times New Roman"/>
+                <w:sz w:val="18"/>
+                <w:szCs w:val="18"/>
+              </w:rPr>
+              <w:t>documented</w:t>
+            </w:r>
+            <w:proofErr w:type="gramEnd"/>
+            <w:r>
+              <w:rPr>
+                <w:rFonts w:ascii="Times New Roman" w:hAnsi="Times New Roman"/>
+                <w:sz w:val="18"/>
+                <w:szCs w:val="18"/>
+              </w:rPr>
+              <w:t xml:space="preserve"> and procedures established for monitoring and controlling the work environment?</w:t>
             </w:r>
           </w:p>
         </w:tc>
@@ -17668,7 +16994,7 @@
           </w:tcPr>
           <w:p>
             <w:pPr>
-              <w:pStyle w:val="ListParagraph"/>
+              <w:pStyle w:val="ListeParagraf"/>
               <w:numPr>
                 <w:ilvl w:val="0"/>
                 <w:numId w:val="22"/>
@@ -17694,7 +17020,7 @@
           </w:p>
           <w:p>
             <w:pPr>
-              <w:pStyle w:val="ListParagraph"/>
+              <w:pStyle w:val="ListeParagraf"/>
               <w:snapToGrid w:val="0"/>
               <w:spacing w:after="0"/>
               <w:ind w:left="204"/>
@@ -17754,7 +17080,7 @@
           </w:tcPr>
           <w:p>
             <w:pPr>
-              <w:pStyle w:val="ListParagraph"/>
+              <w:pStyle w:val="ListeParagraf"/>
               <w:numPr>
                 <w:ilvl w:val="0"/>
                 <w:numId w:val="22"/>
@@ -17780,7 +17106,7 @@
           </w:p>
           <w:p>
             <w:pPr>
-              <w:pStyle w:val="ListParagraph"/>
+              <w:pStyle w:val="ListeParagraf"/>
               <w:snapToGrid w:val="0"/>
               <w:spacing w:after="0"/>
               <w:ind w:left="318"/>
@@ -17840,7 +17166,7 @@
           </w:tcPr>
           <w:p>
             <w:pPr>
-              <w:pStyle w:val="ListParagraph"/>
+              <w:pStyle w:val="ListeParagraf"/>
               <w:numPr>
                 <w:ilvl w:val="0"/>
                 <w:numId w:val="22"/>
@@ -17866,7 +17192,7 @@
           </w:p>
           <w:p>
             <w:pPr>
-              <w:pStyle w:val="ListParagraph"/>
+              <w:pStyle w:val="ListeParagraf"/>
               <w:snapToGrid w:val="0"/>
               <w:spacing w:after="0"/>
               <w:ind w:left="318"/>
@@ -17926,7 +17252,7 @@
           </w:tcPr>
           <w:p>
             <w:pPr>
-              <w:pStyle w:val="ListParagraph"/>
+              <w:pStyle w:val="ListeParagraf"/>
               <w:numPr>
                 <w:ilvl w:val="0"/>
                 <w:numId w:val="22"/>
@@ -17952,7 +17278,7 @@
           </w:p>
           <w:p>
             <w:pPr>
-              <w:pStyle w:val="ListParagraph"/>
+              <w:pStyle w:val="ListeParagraf"/>
               <w:snapToGrid w:val="0"/>
               <w:spacing w:after="0"/>
               <w:ind w:left="318"/>
@@ -18012,7 +17338,7 @@
           </w:tcPr>
           <w:p>
             <w:pPr>
-              <w:pStyle w:val="ListParagraph"/>
+              <w:pStyle w:val="ListeParagraf"/>
               <w:numPr>
                 <w:ilvl w:val="0"/>
                 <w:numId w:val="22"/>
@@ -18132,7 +17458,25 @@
                 <w:sz w:val="18"/>
                 <w:szCs w:val="18"/>
               </w:rPr>
-              <w:t>Does the organization review product requirements? Is this review conducted before the organization commits to supplying the product to the customer ( e.g. , issuing offers, accepting contracts or orders, accepting changes to contracts or orders), and does this review ensure that:</w:t>
+              <w:t xml:space="preserve">Does the organization review product requirements? Is this review conducted before the organization commits to supplying the product to the customer </w:t>
+            </w:r>
+            <w:proofErr w:type="gramStart"/>
+            <w:r>
+              <w:rPr>
+                <w:rFonts w:ascii="Times New Roman" w:hAnsi="Times New Roman"/>
+                <w:sz w:val="18"/>
+                <w:szCs w:val="18"/>
+              </w:rPr>
+              <w:t>( e.g.</w:t>
+            </w:r>
+            <w:proofErr w:type="gramEnd"/>
+            <w:r>
+              <w:rPr>
+                <w:rFonts w:ascii="Times New Roman" w:hAnsi="Times New Roman"/>
+                <w:sz w:val="18"/>
+                <w:szCs w:val="18"/>
+              </w:rPr>
+              <w:t xml:space="preserve"> , issuing offers, accepting contracts or orders, accepting changes to contracts or orders), and does this review ensure that:</w:t>
             </w:r>
           </w:p>
         </w:tc>
@@ -18183,7 +17527,7 @@
           </w:tcPr>
           <w:p>
             <w:pPr>
-              <w:pStyle w:val="ListParagraph"/>
+              <w:pStyle w:val="ListeParagraf"/>
               <w:numPr>
                 <w:ilvl w:val="0"/>
                 <w:numId w:val="23"/>
@@ -18256,7 +17600,7 @@
           </w:tcPr>
           <w:p>
             <w:pPr>
-              <w:pStyle w:val="ListParagraph"/>
+              <w:pStyle w:val="ListeParagraf"/>
               <w:numPr>
                 <w:ilvl w:val="0"/>
                 <w:numId w:val="23"/>
@@ -18328,7 +17672,7 @@
           </w:tcPr>
           <w:p>
             <w:pPr>
-              <w:pStyle w:val="ListParagraph"/>
+              <w:pStyle w:val="ListeParagraf"/>
               <w:numPr>
                 <w:ilvl w:val="0"/>
                 <w:numId w:val="23"/>
@@ -18400,7 +17744,7 @@
           </w:tcPr>
           <w:p>
             <w:pPr>
-              <w:pStyle w:val="ListParagraph"/>
+              <w:pStyle w:val="ListeParagraf"/>
               <w:numPr>
                 <w:ilvl w:val="0"/>
                 <w:numId w:val="23"/>
@@ -18472,7 +17816,7 @@
           </w:tcPr>
           <w:p>
             <w:pPr>
-              <w:pStyle w:val="ListParagraph"/>
+              <w:pStyle w:val="ListeParagraf"/>
               <w:numPr>
                 <w:ilvl w:val="0"/>
                 <w:numId w:val="23"/>
@@ -19474,7 +18818,27 @@
                 <w:sz w:val="18"/>
                 <w:szCs w:val="18"/>
               </w:rPr>
-              <w:t>a) functional, performance, usability and safety requirements according to the intended use,</w:t>
+              <w:t xml:space="preserve">a) </w:t>
+            </w:r>
+            <w:proofErr w:type="gramStart"/>
+            <w:r>
+              <w:rPr>
+                <w:rFonts w:ascii="Times New Roman" w:hAnsi="Times New Roman"/>
+                <w:bCs/>
+                <w:sz w:val="18"/>
+                <w:szCs w:val="18"/>
+              </w:rPr>
+              <w:t>functional,</w:t>
+            </w:r>
+            <w:proofErr w:type="gramEnd"/>
+            <w:r>
+              <w:rPr>
+                <w:rFonts w:ascii="Times New Roman" w:hAnsi="Times New Roman"/>
+                <w:bCs/>
+                <w:sz w:val="18"/>
+                <w:szCs w:val="18"/>
+              </w:rPr>
+              <w:t xml:space="preserve"> performance, usability and safety requirements according to the intended use,</w:t>
             </w:r>
           </w:p>
           <w:p>
@@ -19789,8 +19153,19 @@
                 <w:sz w:val="18"/>
                 <w:szCs w:val="18"/>
               </w:rPr>
-              <w:t>Design and development outputs;</w:t>
-            </w:r>
+              <w:t xml:space="preserve">Design and development </w:t>
+            </w:r>
+            <w:proofErr w:type="gramStart"/>
+            <w:r>
+              <w:rPr>
+                <w:rFonts w:ascii="Times New Roman" w:hAnsi="Times New Roman"/>
+                <w:bCs/>
+                <w:sz w:val="18"/>
+                <w:szCs w:val="18"/>
+              </w:rPr>
+              <w:t>outputs;</w:t>
+            </w:r>
+            <w:proofErr w:type="gramEnd"/>
           </w:p>
           <w:p>
             <w:pPr>
@@ -20196,7 +19571,27 @@
                 <w:sz w:val="18"/>
                 <w:szCs w:val="18"/>
               </w:rPr>
-              <w:t>b) Is design and development systematically reviewed to identify and recommend necessary actions?</w:t>
+              <w:t xml:space="preserve">b) </w:t>
+            </w:r>
+            <w:proofErr w:type="gramStart"/>
+            <w:r>
+              <w:rPr>
+                <w:rFonts w:ascii="Times New Roman" w:hAnsi="Times New Roman"/>
+                <w:bCs/>
+                <w:sz w:val="18"/>
+                <w:szCs w:val="18"/>
+              </w:rPr>
+              <w:t>Is</w:t>
+            </w:r>
+            <w:proofErr w:type="gramEnd"/>
+            <w:r>
+              <w:rPr>
+                <w:rFonts w:ascii="Times New Roman" w:hAnsi="Times New Roman"/>
+                <w:bCs/>
+                <w:sz w:val="18"/>
+                <w:szCs w:val="18"/>
+              </w:rPr>
+              <w:t xml:space="preserve"> design and development systematically reviewed to identify and recommend necessary actions?</w:t>
             </w:r>
           </w:p>
         </w:tc>
@@ -20363,8 +19758,19 @@
                 <w:sz w:val="18"/>
                 <w:szCs w:val="18"/>
               </w:rPr>
-              <w:t>document validation plans that include statistical techniques with justification for methods, acceptance criteria, and sample size, as applicable ?</w:t>
-            </w:r>
+              <w:t xml:space="preserve">document validation plans that include statistical techniques with justification for methods, acceptance criteria, and sample size, as </w:t>
+            </w:r>
+            <w:proofErr w:type="gramStart"/>
+            <w:r>
+              <w:rPr>
+                <w:rFonts w:ascii="Times New Roman" w:hAnsi="Times New Roman"/>
+                <w:bCs/>
+                <w:sz w:val="18"/>
+                <w:szCs w:val="18"/>
+              </w:rPr>
+              <w:t>applicable ?</w:t>
+            </w:r>
+            <w:proofErr w:type="gramEnd"/>
           </w:p>
         </w:tc>
         <w:tc>
@@ -20671,8 +20077,39 @@
                 <w:szCs w:val="18"/>
               </w:rPr>
               <w:lastRenderedPageBreak/>
-              <w:t>ensure that the final product is capable of meeting the requirements for the stated application or intended use ?</w:t>
-            </w:r>
+              <w:t xml:space="preserve">ensure that the final product </w:t>
+            </w:r>
+            <w:proofErr w:type="gramStart"/>
+            <w:r>
+              <w:rPr>
+                <w:rFonts w:ascii="Times New Roman" w:hAnsi="Times New Roman"/>
+                <w:bCs/>
+                <w:sz w:val="18"/>
+                <w:szCs w:val="18"/>
+              </w:rPr>
+              <w:t>is capable of meeting</w:t>
+            </w:r>
+            <w:proofErr w:type="gramEnd"/>
+            <w:r>
+              <w:rPr>
+                <w:rFonts w:ascii="Times New Roman" w:hAnsi="Times New Roman"/>
+                <w:bCs/>
+                <w:sz w:val="18"/>
+                <w:szCs w:val="18"/>
+              </w:rPr>
+              <w:t xml:space="preserve"> the requirements for the stated application or intended </w:t>
+            </w:r>
+            <w:proofErr w:type="gramStart"/>
+            <w:r>
+              <w:rPr>
+                <w:rFonts w:ascii="Times New Roman" w:hAnsi="Times New Roman"/>
+                <w:bCs/>
+                <w:sz w:val="18"/>
+                <w:szCs w:val="18"/>
+              </w:rPr>
+              <w:t>use ?</w:t>
+            </w:r>
+            <w:proofErr w:type="gramEnd"/>
           </w:p>
         </w:tc>
         <w:tc>
@@ -20738,8 +20175,19 @@
                 <w:sz w:val="18"/>
                 <w:szCs w:val="18"/>
               </w:rPr>
-              <w:t>document validation plans that include methods, acceptance criteria, and statistical techniques with justification for sample size, as applicable ?</w:t>
-            </w:r>
+              <w:t xml:space="preserve">document validation plans that include methods, acceptance criteria, and statistical techniques with justification for sample size, as </w:t>
+            </w:r>
+            <w:proofErr w:type="gramStart"/>
+            <w:r>
+              <w:rPr>
+                <w:rFonts w:ascii="Times New Roman" w:hAnsi="Times New Roman"/>
+                <w:bCs/>
+                <w:sz w:val="18"/>
+                <w:szCs w:val="18"/>
+              </w:rPr>
+              <w:t>applicable ?</w:t>
+            </w:r>
+            <w:proofErr w:type="gramEnd"/>
           </w:p>
         </w:tc>
         <w:tc>
@@ -20819,6 +20267,7 @@
                 <w:szCs w:val="18"/>
               </w:rPr>
             </w:pPr>
+            <w:proofErr w:type="gramStart"/>
             <w:r>
               <w:rPr>
                 <w:rFonts w:ascii="Times New Roman" w:hAnsi="Times New Roman"/>
@@ -20826,29 +20275,41 @@
                 <w:sz w:val="18"/>
                 <w:szCs w:val="18"/>
               </w:rPr>
-              <w:t>units , batches or their equivalents? Reasons for selecting the product used for validation</w:t>
-            </w:r>
-          </w:p>
-          <w:p>
-            <w:pPr>
-              <w:spacing w:after="0" w:line="240" w:lineRule="auto"/>
-              <w:jc w:val="both"/>
+              <w:t>units ,</w:t>
+            </w:r>
+            <w:proofErr w:type="gramEnd"/>
+            <w:r>
               <w:rPr>
                 <w:rFonts w:ascii="Times New Roman" w:hAnsi="Times New Roman"/>
                 <w:bCs/>
                 <w:sz w:val="18"/>
                 <w:szCs w:val="18"/>
               </w:rPr>
-            </w:pPr>
-            <w:r>
+              <w:t xml:space="preserve"> batches or their equivalents? Reasons for selecting the product used for validation</w:t>
+            </w:r>
+          </w:p>
+          <w:p>
+            <w:pPr>
+              <w:spacing w:after="0" w:line="240" w:lineRule="auto"/>
+              <w:jc w:val="both"/>
               <w:rPr>
                 <w:rFonts w:ascii="Times New Roman" w:hAnsi="Times New Roman"/>
                 <w:bCs/>
                 <w:sz w:val="18"/>
                 <w:szCs w:val="18"/>
               </w:rPr>
+            </w:pPr>
+            <w:proofErr w:type="gramStart"/>
+            <w:r>
+              <w:rPr>
+                <w:rFonts w:ascii="Times New Roman" w:hAnsi="Times New Roman"/>
+                <w:bCs/>
+                <w:sz w:val="18"/>
+                <w:szCs w:val="18"/>
+              </w:rPr>
               <w:t>recorded ?</w:t>
             </w:r>
+            <w:proofErr w:type="gramEnd"/>
           </w:p>
         </w:tc>
         <w:tc>
@@ -21516,6 +20977,7 @@
                 <w:szCs w:val="18"/>
               </w:rPr>
             </w:pPr>
+            <w:proofErr w:type="gramStart"/>
             <w:r>
               <w:rPr>
                 <w:rFonts w:ascii="Times New Roman" w:hAnsi="Times New Roman"/>
@@ -21523,7 +20985,17 @@
                 <w:sz w:val="18"/>
                 <w:szCs w:val="18"/>
               </w:rPr>
-              <w:t xml:space="preserve">document procedures for controlling design and development </w:t>
+              <w:t>document</w:t>
+            </w:r>
+            <w:proofErr w:type="gramEnd"/>
+            <w:r>
+              <w:rPr>
+                <w:rFonts w:ascii="Times New Roman" w:hAnsi="Times New Roman"/>
+                <w:bCs/>
+                <w:sz w:val="18"/>
+                <w:szCs w:val="18"/>
+              </w:rPr>
+              <w:t xml:space="preserve"> procedures for controlling design and development </w:t>
             </w:r>
             <w:r>
               <w:rPr>
@@ -21919,7 +21391,27 @@
                 <w:sz w:val="18"/>
                 <w:szCs w:val="18"/>
               </w:rPr>
-              <w:t>Does this file contain or reference records created to demonstrate compliance with design and development requirements and records related to design and development changes?</w:t>
+              <w:t xml:space="preserve">Does this file </w:t>
+            </w:r>
+            <w:proofErr w:type="gramStart"/>
+            <w:r>
+              <w:rPr>
+                <w:rFonts w:ascii="Times New Roman" w:hAnsi="Times New Roman"/>
+                <w:bCs/>
+                <w:sz w:val="18"/>
+                <w:szCs w:val="18"/>
+              </w:rPr>
+              <w:t>contain</w:t>
+            </w:r>
+            <w:proofErr w:type="gramEnd"/>
+            <w:r>
+              <w:rPr>
+                <w:rFonts w:ascii="Times New Roman" w:hAnsi="Times New Roman"/>
+                <w:bCs/>
+                <w:sz w:val="18"/>
+                <w:szCs w:val="18"/>
+              </w:rPr>
+              <w:t xml:space="preserve"> or reference records created to demonstrate compliance with design and development requirements and records related to design and development changes?</w:t>
             </w:r>
           </w:p>
         </w:tc>
@@ -22521,13 +22013,23 @@
                 <w:szCs w:val="18"/>
               </w:rPr>
             </w:pPr>
-            <w:r>
-              <w:rPr>
-                <w:rFonts w:ascii="Times New Roman" w:hAnsi="Times New Roman"/>
-                <w:sz w:val="18"/>
-                <w:szCs w:val="18"/>
-              </w:rPr>
-              <w:t>Is the type and extent of control applied to the supplier determined by the impact of the purchased product on production and completion of production?</w:t>
+            <w:proofErr w:type="gramStart"/>
+            <w:r>
+              <w:rPr>
+                <w:rFonts w:ascii="Times New Roman" w:hAnsi="Times New Roman"/>
+                <w:sz w:val="18"/>
+                <w:szCs w:val="18"/>
+              </w:rPr>
+              <w:t>Is</w:t>
+            </w:r>
+            <w:proofErr w:type="gramEnd"/>
+            <w:r>
+              <w:rPr>
+                <w:rFonts w:ascii="Times New Roman" w:hAnsi="Times New Roman"/>
+                <w:sz w:val="18"/>
+                <w:szCs w:val="18"/>
+              </w:rPr>
+              <w:t xml:space="preserve"> the type and extent of control applied to the supplier determined by the impact of the purchased product on production and completion of production?</w:t>
             </w:r>
           </w:p>
         </w:tc>
@@ -23611,8 +23113,18 @@
                 <w:sz w:val="18"/>
                 <w:szCs w:val="18"/>
               </w:rPr>
-              <w:t>a) documentation of procedures and methods for controlling production (see 4.2.4);</w:t>
-            </w:r>
+              <w:t>a) documentation of procedures and methods for controlling production (see 4.2.4</w:t>
+            </w:r>
+            <w:proofErr w:type="gramStart"/>
+            <w:r>
+              <w:rPr>
+                <w:rFonts w:ascii="Times New Roman" w:hAnsi="Times New Roman"/>
+                <w:sz w:val="18"/>
+                <w:szCs w:val="18"/>
+              </w:rPr>
+              <w:t>);</w:t>
+            </w:r>
+            <w:proofErr w:type="gramEnd"/>
           </w:p>
           <w:p>
             <w:pPr>
@@ -23939,8 +23451,18 @@
                 <w:sz w:val="18"/>
                 <w:szCs w:val="18"/>
               </w:rPr>
-              <w:t>documented requirements for product cleaning and contamination control for the following situations ?</w:t>
-            </w:r>
+              <w:t xml:space="preserve">documented requirements for product cleaning and contamination control for the following </w:t>
+            </w:r>
+            <w:proofErr w:type="gramStart"/>
+            <w:r>
+              <w:rPr>
+                <w:rFonts w:ascii="Times New Roman" w:hAnsi="Times New Roman"/>
+                <w:sz w:val="18"/>
+                <w:szCs w:val="18"/>
+              </w:rPr>
+              <w:t>situations ?</w:t>
+            </w:r>
+            <w:proofErr w:type="gramEnd"/>
           </w:p>
           <w:p>
             <w:pPr>
@@ -25007,7 +24529,25 @@
                 <w:sz w:val="18"/>
                 <w:szCs w:val="18"/>
               </w:rPr>
-              <w:t xml:space="preserve">document procedures for validating the implementation of computer software used in production and service delivery ? Are such software applications validated before initial use and, if appropriate, after any changes to the software or its </w:t>
+              <w:t xml:space="preserve">document procedures for validating the implementation of computer software used in production and service </w:t>
+            </w:r>
+            <w:proofErr w:type="gramStart"/>
+            <w:r>
+              <w:rPr>
+                <w:rFonts w:ascii="Times New Roman" w:hAnsi="Times New Roman"/>
+                <w:sz w:val="18"/>
+                <w:szCs w:val="18"/>
+              </w:rPr>
+              <w:t>delivery ?</w:t>
+            </w:r>
+            <w:proofErr w:type="gramEnd"/>
+            <w:r>
+              <w:rPr>
+                <w:rFonts w:ascii="Times New Roman" w:hAnsi="Times New Roman"/>
+                <w:sz w:val="18"/>
+                <w:szCs w:val="18"/>
+              </w:rPr>
+              <w:t xml:space="preserve"> Are such software applications validated before initial use and, if appropriate, after any changes to the software or its </w:t>
             </w:r>
             <w:r>
               <w:rPr>
@@ -25180,8 +24720,18 @@
                 <w:sz w:val="18"/>
                 <w:szCs w:val="18"/>
               </w:rPr>
-              <w:t>documented procedures for validation of sterilization and sterile barrier systems processes ?</w:t>
-            </w:r>
+              <w:t xml:space="preserve">documented procedures for validation of sterilization and sterile barrier systems </w:t>
+            </w:r>
+            <w:proofErr w:type="gramStart"/>
+            <w:r>
+              <w:rPr>
+                <w:rFonts w:ascii="Times New Roman" w:hAnsi="Times New Roman"/>
+                <w:sz w:val="18"/>
+                <w:szCs w:val="18"/>
+              </w:rPr>
+              <w:t>processes ?</w:t>
+            </w:r>
+            <w:proofErr w:type="gramEnd"/>
           </w:p>
         </w:tc>
         <w:tc>
@@ -25727,6 +25277,7 @@
                 <w:szCs w:val="18"/>
               </w:rPr>
             </w:pPr>
+            <w:proofErr w:type="gramStart"/>
             <w:r>
               <w:rPr>
                 <w:rFonts w:ascii="Times New Roman" w:hAnsi="Times New Roman"/>
@@ -25734,8 +25285,27 @@
                 <w:szCs w:val="18"/>
               </w:rPr>
               <w:lastRenderedPageBreak/>
-              <w:t>the organization defined the product by appropriate means throughout product realization and has it established a documented procedure for this product definition process ?</w:t>
-            </w:r>
+              <w:t>the</w:t>
+            </w:r>
+            <w:proofErr w:type="gramEnd"/>
+            <w:r>
+              <w:rPr>
+                <w:rFonts w:ascii="Times New Roman" w:hAnsi="Times New Roman"/>
+                <w:sz w:val="18"/>
+                <w:szCs w:val="18"/>
+              </w:rPr>
+              <w:t xml:space="preserve"> organization defined the product by appropriate means throughout product realization and has it established a documented procedure for this product definition </w:t>
+            </w:r>
+            <w:proofErr w:type="gramStart"/>
+            <w:r>
+              <w:rPr>
+                <w:rFonts w:ascii="Times New Roman" w:hAnsi="Times New Roman"/>
+                <w:sz w:val="18"/>
+                <w:szCs w:val="18"/>
+              </w:rPr>
+              <w:t>process ?</w:t>
+            </w:r>
+            <w:proofErr w:type="gramEnd"/>
           </w:p>
         </w:tc>
         <w:tc>
@@ -25931,8 +25501,18 @@
                 <w:sz w:val="18"/>
                 <w:szCs w:val="18"/>
               </w:rPr>
-              <w:t>documented a system for assigning unique device codes to medical devices when required by applicable legal requirements ?</w:t>
-            </w:r>
+              <w:t xml:space="preserve">documented a system for assigning unique device codes to medical devices when required by applicable legal </w:t>
+            </w:r>
+            <w:proofErr w:type="gramStart"/>
+            <w:r>
+              <w:rPr>
+                <w:rFonts w:ascii="Times New Roman" w:hAnsi="Times New Roman"/>
+                <w:sz w:val="18"/>
+                <w:szCs w:val="18"/>
+              </w:rPr>
+              <w:t>requirements ?</w:t>
+            </w:r>
+            <w:proofErr w:type="gramEnd"/>
           </w:p>
         </w:tc>
         <w:tc>
@@ -25996,8 +25576,18 @@
                 <w:sz w:val="18"/>
                 <w:szCs w:val="18"/>
               </w:rPr>
-              <w:t>Has the organization established a documented procedure to identify returned medical devices and distinguish them from compliant products ?</w:t>
-            </w:r>
+              <w:t xml:space="preserve">Has the organization established a documented procedure to identify returned medical devices and distinguish them from compliant </w:t>
+            </w:r>
+            <w:proofErr w:type="gramStart"/>
+            <w:r>
+              <w:rPr>
+                <w:rFonts w:ascii="Times New Roman" w:hAnsi="Times New Roman"/>
+                <w:sz w:val="18"/>
+                <w:szCs w:val="18"/>
+              </w:rPr>
+              <w:t>products ?</w:t>
+            </w:r>
+            <w:proofErr w:type="gramEnd"/>
           </w:p>
         </w:tc>
         <w:tc>
@@ -26127,7 +25717,25 @@
                 <w:sz w:val="18"/>
                 <w:szCs w:val="18"/>
               </w:rPr>
-              <w:t>documented procedures for traceability ? Do these procedures define the extent of traceability in accordance with applicable legal requirements and records maintained?</w:t>
+              <w:t xml:space="preserve">documented procedures for </w:t>
+            </w:r>
+            <w:proofErr w:type="gramStart"/>
+            <w:r>
+              <w:rPr>
+                <w:rFonts w:ascii="Times New Roman" w:hAnsi="Times New Roman"/>
+                <w:sz w:val="18"/>
+                <w:szCs w:val="18"/>
+              </w:rPr>
+              <w:t>traceability ?</w:t>
+            </w:r>
+            <w:proofErr w:type="gramEnd"/>
+            <w:r>
+              <w:rPr>
+                <w:rFonts w:ascii="Times New Roman" w:hAnsi="Times New Roman"/>
+                <w:sz w:val="18"/>
+                <w:szCs w:val="18"/>
+              </w:rPr>
+              <w:t xml:space="preserve"> Do these procedures define the extent of traceability in accordance with applicable legal requirements and records maintained?</w:t>
             </w:r>
           </w:p>
         </w:tc>
@@ -26350,13 +25958,23 @@
                 <w:szCs w:val="18"/>
               </w:rPr>
             </w:pPr>
-            <w:r>
-              <w:rPr>
-                <w:rFonts w:ascii="Times New Roman" w:hAnsi="Times New Roman"/>
-                <w:sz w:val="18"/>
-                <w:szCs w:val="18"/>
-              </w:rPr>
-              <w:t>Is the name and address of the recipient of the package recorded?</w:t>
+            <w:proofErr w:type="gramStart"/>
+            <w:r>
+              <w:rPr>
+                <w:rFonts w:ascii="Times New Roman" w:hAnsi="Times New Roman"/>
+                <w:sz w:val="18"/>
+                <w:szCs w:val="18"/>
+              </w:rPr>
+              <w:t>Is</w:t>
+            </w:r>
+            <w:proofErr w:type="gramEnd"/>
+            <w:r>
+              <w:rPr>
+                <w:rFonts w:ascii="Times New Roman" w:hAnsi="Times New Roman"/>
+                <w:sz w:val="18"/>
+                <w:szCs w:val="18"/>
+              </w:rPr>
+              <w:t xml:space="preserve"> the name and address of the recipient of the package recorded?</w:t>
             </w:r>
           </w:p>
         </w:tc>
@@ -26620,8 +26238,19 @@
                 <w:sz w:val="18"/>
                 <w:szCs w:val="18"/>
               </w:rPr>
-              <w:t>Does the organization protect the product from alteration, contamination, or damage when exposed to expected conditions and hazards during processing, storage, transportation, and distribution by designing appropriate packaging and shipping containers and documenting the requirements of special conditions if packaging alone cannot provide protection ?</w:t>
-            </w:r>
+              <w:t xml:space="preserve">Does the organization protect the product from alteration, contamination, or damage when exposed to expected conditions and hazards during processing, storage, transportation, and distribution by designing appropriate packaging and shipping containers and documenting the requirements of special conditions if packaging alone cannot provide </w:t>
+            </w:r>
+            <w:proofErr w:type="gramStart"/>
+            <w:r>
+              <w:rPr>
+                <w:rFonts w:ascii="Times New Roman" w:hAnsi="Times New Roman"/>
+                <w:bCs/>
+                <w:sz w:val="18"/>
+                <w:szCs w:val="18"/>
+              </w:rPr>
+              <w:t>protection ?</w:t>
+            </w:r>
+            <w:proofErr w:type="gramEnd"/>
           </w:p>
         </w:tc>
         <w:tc>
@@ -26967,8 +26596,18 @@
                 <w:sz w:val="18"/>
                 <w:szCs w:val="18"/>
               </w:rPr>
-              <w:t>it being recorded ?</w:t>
-            </w:r>
+              <w:t xml:space="preserve">it being </w:t>
+            </w:r>
+            <w:proofErr w:type="gramStart"/>
+            <w:r>
+              <w:rPr>
+                <w:rFonts w:ascii="Times New Roman" w:hAnsi="Times New Roman"/>
+                <w:sz w:val="18"/>
+                <w:szCs w:val="18"/>
+              </w:rPr>
+              <w:t>recorded ?</w:t>
+            </w:r>
+            <w:proofErr w:type="gramEnd"/>
           </w:p>
           <w:p>
             <w:pPr>
@@ -27304,7 +26943,43 @@
                 <w:sz w:val="18"/>
                 <w:szCs w:val="18"/>
               </w:rPr>
-              <w:t>document procedures for validating the implementation of computer software used in monitoring and measurement requirements ? Are such software applications validated before initial use and, if appropriate, after any changes to the software or its implementation? Are the specific approaches and activities for validating and re-validating software proportionate to the risk associated with using the software, including its impact on the product's ability to conform to specifications?</w:t>
+              <w:t xml:space="preserve">document procedures for validating the implementation of computer software used in monitoring and </w:t>
+            </w:r>
+            <w:proofErr w:type="gramStart"/>
+            <w:r>
+              <w:rPr>
+                <w:rFonts w:ascii="Times New Roman" w:hAnsi="Times New Roman"/>
+                <w:sz w:val="18"/>
+                <w:szCs w:val="18"/>
+              </w:rPr>
+              <w:t>measurement</w:t>
+            </w:r>
+            <w:proofErr w:type="gramEnd"/>
+            <w:r>
+              <w:rPr>
+                <w:rFonts w:ascii="Times New Roman" w:hAnsi="Times New Roman"/>
+                <w:sz w:val="18"/>
+                <w:szCs w:val="18"/>
+              </w:rPr>
+              <w:t xml:space="preserve"> </w:t>
+            </w:r>
+            <w:proofErr w:type="gramStart"/>
+            <w:r>
+              <w:rPr>
+                <w:rFonts w:ascii="Times New Roman" w:hAnsi="Times New Roman"/>
+                <w:sz w:val="18"/>
+                <w:szCs w:val="18"/>
+              </w:rPr>
+              <w:t>requirements ?</w:t>
+            </w:r>
+            <w:proofErr w:type="gramEnd"/>
+            <w:r>
+              <w:rPr>
+                <w:rFonts w:ascii="Times New Roman" w:hAnsi="Times New Roman"/>
+                <w:sz w:val="18"/>
+                <w:szCs w:val="18"/>
+              </w:rPr>
+              <w:t xml:space="preserve"> Are such software applications validated before initial use and, if appropriate, after any changes to the software or its implementation? Are the specific approaches and activities for validating and re-validating software proportionate to the risk associated with using the software, including its impact on the product's ability to conform to specifications?</w:t>
             </w:r>
           </w:p>
         </w:tc>
@@ -27781,7 +27456,25 @@
                 <w:sz w:val="18"/>
                 <w:szCs w:val="18"/>
               </w:rPr>
-              <w:t>documented procedures for the feedback process ? Does this feedback process include requirements for collecting data on post-production activities as well as post-production data?</w:t>
+              <w:t xml:space="preserve">documented procedures for the feedback </w:t>
+            </w:r>
+            <w:proofErr w:type="gramStart"/>
+            <w:r>
+              <w:rPr>
+                <w:rFonts w:ascii="Times New Roman" w:hAnsi="Times New Roman"/>
+                <w:sz w:val="18"/>
+                <w:szCs w:val="18"/>
+              </w:rPr>
+              <w:t>process ?</w:t>
+            </w:r>
+            <w:proofErr w:type="gramEnd"/>
+            <w:r>
+              <w:rPr>
+                <w:rFonts w:ascii="Times New Roman" w:hAnsi="Times New Roman"/>
+                <w:sz w:val="18"/>
+                <w:szCs w:val="18"/>
+              </w:rPr>
+              <w:t xml:space="preserve"> Does this feedback process include requirements for collecting data on post-production activities as well as post-production data?</w:t>
             </w:r>
           </w:p>
         </w:tc>
@@ -28253,8 +27946,19 @@
                 <w:sz w:val="18"/>
                 <w:szCs w:val="18"/>
               </w:rPr>
-              <w:t>If a complaint is not investigated, is the reason documented ?</w:t>
-            </w:r>
+              <w:lastRenderedPageBreak/>
+              <w:t xml:space="preserve">If a complaint is not investigated, is the reason </w:t>
+            </w:r>
+            <w:proofErr w:type="gramStart"/>
+            <w:r>
+              <w:rPr>
+                <w:rFonts w:ascii="Times New Roman" w:hAnsi="Times New Roman"/>
+                <w:sz w:val="18"/>
+                <w:szCs w:val="18"/>
+              </w:rPr>
+              <w:t>documented ?</w:t>
+            </w:r>
+            <w:proofErr w:type="gramEnd"/>
           </w:p>
         </w:tc>
         <w:tc>
@@ -28318,8 +28022,18 @@
                 <w:sz w:val="18"/>
                 <w:szCs w:val="18"/>
               </w:rPr>
-              <w:t>the results of any corrections or corrective actions resulting from the complaint-handling process documented ?</w:t>
-            </w:r>
+              <w:t xml:space="preserve">the results of any corrections or corrective actions resulting from the complaint-handling process </w:t>
+            </w:r>
+            <w:proofErr w:type="gramStart"/>
+            <w:r>
+              <w:rPr>
+                <w:rFonts w:ascii="Times New Roman" w:hAnsi="Times New Roman"/>
+                <w:sz w:val="18"/>
+                <w:szCs w:val="18"/>
+              </w:rPr>
+              <w:t>documented ?</w:t>
+            </w:r>
+            <w:proofErr w:type="gramEnd"/>
           </w:p>
         </w:tc>
         <w:tc>
@@ -28383,7 +28097,6 @@
                 <w:sz w:val="18"/>
                 <w:szCs w:val="18"/>
               </w:rPr>
-              <w:lastRenderedPageBreak/>
               <w:t>If investigations determine that activities outside the organization contributed to the customer complaint, is relevant information exchanged between the organizations involved?</w:t>
             </w:r>
           </w:p>
@@ -28548,8 +28261,18 @@
                 <w:sz w:val="18"/>
                 <w:szCs w:val="18"/>
               </w:rPr>
-              <w:t>If applicable legal requirements require the issuance of complaint reports or advisory notices that meet established “adverse event reporting criteria,” has the organization documented procedures for providing notification to relevant regulatory authorities ?</w:t>
-            </w:r>
+              <w:t xml:space="preserve">If applicable legal requirements require the issuance of complaint reports or advisory notices that meet established “adverse event reporting criteria,” has the organization documented procedures for providing notification to relevant regulatory </w:t>
+            </w:r>
+            <w:proofErr w:type="gramStart"/>
+            <w:r>
+              <w:rPr>
+                <w:rFonts w:ascii="Times New Roman" w:hAnsi="Times New Roman"/>
+                <w:sz w:val="18"/>
+                <w:szCs w:val="18"/>
+              </w:rPr>
+              <w:t>authorities ?</w:t>
+            </w:r>
+            <w:proofErr w:type="gramEnd"/>
           </w:p>
         </w:tc>
         <w:tc>
@@ -28922,7 +28645,16 @@
                 <w:sz w:val="18"/>
                 <w:szCs w:val="18"/>
               </w:rPr>
-              <w:t>Is there a system for generating trend reports? Has this system been defined using statistical methods? Have baselines and thresholds been defined? Are significant increases identified? Does the system specify the use of EUDAMED to notify users of significant increases? Are trend analysis records available and maintained?</w:t>
+              <w:t xml:space="preserve">Is there a system for generating trend reports? Has this system been defined using statistical methods? Have baselines and thresholds been defined? Are significant increases identified? Does the system specify the use of EUDAMED to notify users </w:t>
+            </w:r>
+            <w:r>
+              <w:rPr>
+                <w:rFonts w:ascii="Times New Roman" w:hAnsi="Times New Roman"/>
+                <w:sz w:val="18"/>
+                <w:szCs w:val="18"/>
+              </w:rPr>
+              <w:lastRenderedPageBreak/>
+              <w:t>of significant increases? Are trend analysis records available and maintained?</w:t>
             </w:r>
           </w:p>
         </w:tc>
@@ -29006,7 +28738,6 @@
                 <w:sz w:val="18"/>
                 <w:szCs w:val="18"/>
               </w:rPr>
-              <w:lastRenderedPageBreak/>
               <w:t>Does the process meet the requirements of regulation (EU) 2017/745?</w:t>
             </w:r>
           </w:p>
@@ -29667,6 +29398,7 @@
                 <w:sz w:val="18"/>
                 <w:szCs w:val="18"/>
               </w:rPr>
+              <w:lastRenderedPageBreak/>
               <w:t>Has an internal audit program been prepared, taking into account the status and importance of the areas and processes to be audited and the results of previous internal audits?</w:t>
             </w:r>
           </w:p>
@@ -29733,7 +29465,6 @@
                 <w:sz w:val="18"/>
                 <w:szCs w:val="18"/>
               </w:rPr>
-              <w:lastRenderedPageBreak/>
               <w:t>Have the audit criteria, scope, range and methods been defined and recorded?</w:t>
             </w:r>
           </w:p>
@@ -30586,6 +30317,7 @@
                 <w:sz w:val="18"/>
                 <w:szCs w:val="18"/>
               </w:rPr>
+              <w:lastRenderedPageBreak/>
               <w:t>For Implantable Medical Devices, are the identities of personnel performing any examination or testing recorded?</w:t>
             </w:r>
           </w:p>
@@ -30687,7 +30419,6 @@
                 <w:sz w:val="18"/>
                 <w:szCs w:val="18"/>
               </w:rPr>
-              <w:lastRenderedPageBreak/>
               <w:t>8.3.1. General</w:t>
             </w:r>
           </w:p>
@@ -30718,8 +30449,18 @@
                 <w:sz w:val="18"/>
                 <w:szCs w:val="18"/>
               </w:rPr>
-              <w:t>documented a procedure that defines the documentation, separation, evaluation, disposal, controls, and related responsibilities and authorities for nonconforming product ?</w:t>
-            </w:r>
+              <w:t xml:space="preserve">documented a procedure that defines the documentation, separation, evaluation, disposal, controls, and related responsibilities and authorities for nonconforming </w:t>
+            </w:r>
+            <w:proofErr w:type="gramStart"/>
+            <w:r>
+              <w:rPr>
+                <w:rFonts w:ascii="Times New Roman" w:hAnsi="Times New Roman"/>
+                <w:sz w:val="18"/>
+                <w:szCs w:val="18"/>
+              </w:rPr>
+              <w:t>product ?</w:t>
+            </w:r>
+            <w:proofErr w:type="gramEnd"/>
           </w:p>
         </w:tc>
         <w:tc>
@@ -30946,7 +30687,25 @@
                 <w:sz w:val="18"/>
                 <w:szCs w:val="18"/>
               </w:rPr>
-              <w:t>Does the organization handle nonconforming product in one or more of the following ways?</w:t>
+              <w:t xml:space="preserve">Does the organization handle nonconforming </w:t>
+            </w:r>
+            <w:proofErr w:type="gramStart"/>
+            <w:r>
+              <w:rPr>
+                <w:rFonts w:ascii="Times New Roman" w:hAnsi="Times New Roman"/>
+                <w:sz w:val="18"/>
+                <w:szCs w:val="18"/>
+              </w:rPr>
+              <w:t>product</w:t>
+            </w:r>
+            <w:proofErr w:type="gramEnd"/>
+            <w:r>
+              <w:rPr>
+                <w:rFonts w:ascii="Times New Roman" w:hAnsi="Times New Roman"/>
+                <w:sz w:val="18"/>
+                <w:szCs w:val="18"/>
+              </w:rPr>
+              <w:t xml:space="preserve"> in one or more of the following ways?</w:t>
             </w:r>
           </w:p>
           <w:p>
@@ -31166,7 +30925,25 @@
                 <w:sz w:val="18"/>
                 <w:szCs w:val="18"/>
               </w:rPr>
-              <w:t>When nonconforming product is discovered after delivery or after use has commenced, does the organization take appropriate action and maintain records to address the effects or potential effects of the nonconformity?</w:t>
+              <w:t xml:space="preserve">When nonconforming </w:t>
+            </w:r>
+            <w:proofErr w:type="gramStart"/>
+            <w:r>
+              <w:rPr>
+                <w:rFonts w:ascii="Times New Roman" w:hAnsi="Times New Roman"/>
+                <w:sz w:val="18"/>
+                <w:szCs w:val="18"/>
+              </w:rPr>
+              <w:t>product is</w:t>
+            </w:r>
+            <w:proofErr w:type="gramEnd"/>
+            <w:r>
+              <w:rPr>
+                <w:rFonts w:ascii="Times New Roman" w:hAnsi="Times New Roman"/>
+                <w:sz w:val="18"/>
+                <w:szCs w:val="18"/>
+              </w:rPr>
+              <w:t xml:space="preserve"> discovered after delivery or after use has commenced, does the organization take appropriate action and maintain records to address the effects or potential effects of the nonconformity?</w:t>
             </w:r>
           </w:p>
         </w:tc>
@@ -31231,7 +31008,43 @@
                 <w:sz w:val="18"/>
                 <w:szCs w:val="18"/>
               </w:rPr>
-              <w:t>documented procedures for issuing advisory statements in accordance with applicable regulatory requirements ? Are these procedures applicable at all times?</w:t>
+              <w:t xml:space="preserve">documented procedures for issuing advisory statements in accordance with applicable regulatory </w:t>
+            </w:r>
+            <w:proofErr w:type="gramStart"/>
+            <w:r>
+              <w:rPr>
+                <w:rFonts w:ascii="Times New Roman" w:hAnsi="Times New Roman"/>
+                <w:sz w:val="18"/>
+                <w:szCs w:val="18"/>
+              </w:rPr>
+              <w:t>requirements ?</w:t>
+            </w:r>
+            <w:proofErr w:type="gramEnd"/>
+            <w:r>
+              <w:rPr>
+                <w:rFonts w:ascii="Times New Roman" w:hAnsi="Times New Roman"/>
+                <w:sz w:val="18"/>
+                <w:szCs w:val="18"/>
+              </w:rPr>
+              <w:t xml:space="preserve"> </w:t>
+            </w:r>
+            <w:proofErr w:type="gramStart"/>
+            <w:r>
+              <w:rPr>
+                <w:rFonts w:ascii="Times New Roman" w:hAnsi="Times New Roman"/>
+                <w:sz w:val="18"/>
+                <w:szCs w:val="18"/>
+              </w:rPr>
+              <w:t>Are these procedures applicable at all times</w:t>
+            </w:r>
+            <w:proofErr w:type="gramEnd"/>
+            <w:r>
+              <w:rPr>
+                <w:rFonts w:ascii="Times New Roman" w:hAnsi="Times New Roman"/>
+                <w:sz w:val="18"/>
+                <w:szCs w:val="18"/>
+              </w:rPr>
+              <w:t>?</w:t>
             </w:r>
           </w:p>
         </w:tc>
@@ -31296,6 +31109,7 @@
                 <w:sz w:val="18"/>
                 <w:szCs w:val="18"/>
               </w:rPr>
+              <w:lastRenderedPageBreak/>
               <w:t>Are records kept regarding the publication of advisory notices?</w:t>
             </w:r>
           </w:p>
@@ -31394,8 +31208,25 @@
                 <w:sz w:val="18"/>
                 <w:szCs w:val="18"/>
               </w:rPr>
-              <w:lastRenderedPageBreak/>
-              <w:t>documented procedure for reprocessing been established, taking into account the potential adverse effects of reprocessing on the product? Is this procedure subject to the same review and approval process as the original procedures?</w:t>
+              <w:t xml:space="preserve">documented procedure for reprocessing been established, </w:t>
+            </w:r>
+            <w:proofErr w:type="gramStart"/>
+            <w:r>
+              <w:rPr>
+                <w:rFonts w:ascii="Times New Roman" w:hAnsi="Times New Roman"/>
+                <w:sz w:val="18"/>
+                <w:szCs w:val="18"/>
+              </w:rPr>
+              <w:t>taking into account</w:t>
+            </w:r>
+            <w:proofErr w:type="gramEnd"/>
+            <w:r>
+              <w:rPr>
+                <w:rFonts w:ascii="Times New Roman" w:hAnsi="Times New Roman"/>
+                <w:sz w:val="18"/>
+                <w:szCs w:val="18"/>
+              </w:rPr>
+              <w:t xml:space="preserve"> the potential adverse effects of reprocessing on the product? Is this procedure subject to the same review and approval process as the original procedures?</w:t>
             </w:r>
           </w:p>
         </w:tc>
@@ -31707,7 +31538,25 @@
                 <w:sz w:val="18"/>
                 <w:szCs w:val="18"/>
               </w:rPr>
-              <w:t>a minimum , input from:</w:t>
+              <w:t xml:space="preserve">a </w:t>
+            </w:r>
+            <w:proofErr w:type="gramStart"/>
+            <w:r>
+              <w:rPr>
+                <w:rFonts w:ascii="Times New Roman" w:hAnsi="Times New Roman"/>
+                <w:sz w:val="18"/>
+                <w:szCs w:val="18"/>
+              </w:rPr>
+              <w:t>minimum ,</w:t>
+            </w:r>
+            <w:proofErr w:type="gramEnd"/>
+            <w:r>
+              <w:rPr>
+                <w:rFonts w:ascii="Times New Roman" w:hAnsi="Times New Roman"/>
+                <w:sz w:val="18"/>
+                <w:szCs w:val="18"/>
+              </w:rPr>
+              <w:t xml:space="preserve"> input from:</w:t>
             </w:r>
           </w:p>
           <w:p>
@@ -32082,16 +31931,8 @@
                 <w:sz w:val="18"/>
                 <w:szCs w:val="18"/>
               </w:rPr>
-              <w:t xml:space="preserve">Does the organization define and implement any changes necessary to ensure the continued suitability, adequacy and effectiveness of the quality management system as well as the </w:t>
-            </w:r>
-            <w:r>
-              <w:rPr>
-                <w:rFonts w:ascii="Times New Roman" w:hAnsi="Times New Roman"/>
-                <w:sz w:val="18"/>
-                <w:szCs w:val="18"/>
-              </w:rPr>
               <w:lastRenderedPageBreak/>
-              <w:t>safety and performance of medical devices, using the quality policy, quality objectives, audit results, post-marketing surveillance, data analysis, corrective and preventive actions and management review?</w:t>
+              <w:t>Does the organization define and implement any changes necessary to ensure the continued suitability, adequacy and effectiveness of the quality management system as well as the safety and performance of medical devices, using the quality policy, quality objectives, audit results, post-marketing surveillance, data analysis, corrective and preventive actions and management review?</w:t>
             </w:r>
           </w:p>
         </w:tc>
@@ -32175,8 +32016,18 @@
                 <w:sz w:val="18"/>
                 <w:szCs w:val="18"/>
               </w:rPr>
-              <w:t>documented procedures for post-sale surveillance activities ?</w:t>
-            </w:r>
+              <w:t xml:space="preserve">documented procedures for post-sale surveillance </w:t>
+            </w:r>
+            <w:proofErr w:type="gramStart"/>
+            <w:r>
+              <w:rPr>
+                <w:rFonts w:ascii="Times New Roman" w:hAnsi="Times New Roman"/>
+                <w:sz w:val="18"/>
+                <w:szCs w:val="18"/>
+              </w:rPr>
+              <w:t>activities ?</w:t>
+            </w:r>
+            <w:proofErr w:type="gramEnd"/>
           </w:p>
           <w:p>
             <w:pPr>
@@ -32514,65 +32365,105 @@
                 <w:sz w:val="18"/>
                 <w:szCs w:val="18"/>
               </w:rPr>
-              <w:t>- Information on serious accidents, including field safety corrective actions and information from PSUR;</w:t>
-            </w:r>
-          </w:p>
-          <w:p>
-            <w:pPr>
-              <w:spacing w:after="0" w:line="240" w:lineRule="auto"/>
-              <w:jc w:val="both"/>
-              <w:rPr>
-                <w:rFonts w:ascii="Times New Roman" w:hAnsi="Times New Roman"/>
-                <w:sz w:val="18"/>
-                <w:szCs w:val="18"/>
-              </w:rPr>
-            </w:pPr>
-            <w:r>
-              <w:rPr>
-                <w:rFonts w:ascii="Times New Roman" w:hAnsi="Times New Roman"/>
-                <w:sz w:val="18"/>
-                <w:szCs w:val="18"/>
-              </w:rPr>
-              <w:t>- Records referring to any adverse event data and non-serious accidents;</w:t>
-            </w:r>
-          </w:p>
-          <w:p>
-            <w:pPr>
-              <w:spacing w:after="0" w:line="240" w:lineRule="auto"/>
-              <w:jc w:val="both"/>
-              <w:rPr>
-                <w:rFonts w:ascii="Times New Roman" w:hAnsi="Times New Roman"/>
-                <w:sz w:val="18"/>
-                <w:szCs w:val="18"/>
-              </w:rPr>
-            </w:pPr>
-            <w:r>
-              <w:rPr>
-                <w:rFonts w:ascii="Times New Roman" w:hAnsi="Times New Roman"/>
-                <w:sz w:val="18"/>
-                <w:szCs w:val="18"/>
-              </w:rPr>
-              <w:t>- Information from Trend Reporting;</w:t>
-            </w:r>
-          </w:p>
-          <w:p>
-            <w:pPr>
-              <w:spacing w:after="0" w:line="240" w:lineRule="auto"/>
-              <w:jc w:val="both"/>
-              <w:rPr>
-                <w:rFonts w:ascii="Times New Roman" w:hAnsi="Times New Roman"/>
-                <w:sz w:val="18"/>
-                <w:szCs w:val="18"/>
-              </w:rPr>
-            </w:pPr>
-            <w:r>
-              <w:rPr>
-                <w:rFonts w:ascii="Times New Roman" w:hAnsi="Times New Roman"/>
-                <w:sz w:val="18"/>
-                <w:szCs w:val="18"/>
-              </w:rPr>
-              <w:t>- Relevant specialist or technical literature, databases and/or records;</w:t>
-            </w:r>
+              <w:t xml:space="preserve">- Information on serious accidents, including field safety corrective actions and information from </w:t>
+            </w:r>
+            <w:proofErr w:type="gramStart"/>
+            <w:r>
+              <w:rPr>
+                <w:rFonts w:ascii="Times New Roman" w:hAnsi="Times New Roman"/>
+                <w:sz w:val="18"/>
+                <w:szCs w:val="18"/>
+              </w:rPr>
+              <w:t>PSUR;</w:t>
+            </w:r>
+            <w:proofErr w:type="gramEnd"/>
+          </w:p>
+          <w:p>
+            <w:pPr>
+              <w:spacing w:after="0" w:line="240" w:lineRule="auto"/>
+              <w:jc w:val="both"/>
+              <w:rPr>
+                <w:rFonts w:ascii="Times New Roman" w:hAnsi="Times New Roman"/>
+                <w:sz w:val="18"/>
+                <w:szCs w:val="18"/>
+              </w:rPr>
+            </w:pPr>
+            <w:r>
+              <w:rPr>
+                <w:rFonts w:ascii="Times New Roman" w:hAnsi="Times New Roman"/>
+                <w:sz w:val="18"/>
+                <w:szCs w:val="18"/>
+              </w:rPr>
+              <w:t xml:space="preserve">- Records referring to any adverse event data and non-serious </w:t>
+            </w:r>
+            <w:proofErr w:type="gramStart"/>
+            <w:r>
+              <w:rPr>
+                <w:rFonts w:ascii="Times New Roman" w:hAnsi="Times New Roman"/>
+                <w:sz w:val="18"/>
+                <w:szCs w:val="18"/>
+              </w:rPr>
+              <w:t>accidents;</w:t>
+            </w:r>
+            <w:proofErr w:type="gramEnd"/>
+          </w:p>
+          <w:p>
+            <w:pPr>
+              <w:spacing w:after="0" w:line="240" w:lineRule="auto"/>
+              <w:jc w:val="both"/>
+              <w:rPr>
+                <w:rFonts w:ascii="Times New Roman" w:hAnsi="Times New Roman"/>
+                <w:sz w:val="18"/>
+                <w:szCs w:val="18"/>
+              </w:rPr>
+            </w:pPr>
+            <w:r>
+              <w:rPr>
+                <w:rFonts w:ascii="Times New Roman" w:hAnsi="Times New Roman"/>
+                <w:sz w:val="18"/>
+                <w:szCs w:val="18"/>
+              </w:rPr>
+              <w:t xml:space="preserve">- Information from Trend </w:t>
+            </w:r>
+            <w:proofErr w:type="gramStart"/>
+            <w:r>
+              <w:rPr>
+                <w:rFonts w:ascii="Times New Roman" w:hAnsi="Times New Roman"/>
+                <w:sz w:val="18"/>
+                <w:szCs w:val="18"/>
+              </w:rPr>
+              <w:t>Reporting;</w:t>
+            </w:r>
+            <w:proofErr w:type="gramEnd"/>
+          </w:p>
+          <w:p>
+            <w:pPr>
+              <w:spacing w:after="0" w:line="240" w:lineRule="auto"/>
+              <w:jc w:val="both"/>
+              <w:rPr>
+                <w:rFonts w:ascii="Times New Roman" w:hAnsi="Times New Roman"/>
+                <w:sz w:val="18"/>
+                <w:szCs w:val="18"/>
+              </w:rPr>
+            </w:pPr>
+            <w:r>
+              <w:rPr>
+                <w:rFonts w:ascii="Times New Roman" w:hAnsi="Times New Roman"/>
+                <w:sz w:val="18"/>
+                <w:szCs w:val="18"/>
+              </w:rPr>
+              <w:t xml:space="preserve">- Relevant specialist or technical literature, databases and/or </w:t>
+            </w:r>
+            <w:proofErr w:type="gramStart"/>
+            <w:r>
+              <w:rPr>
+                <w:rFonts w:ascii="Times New Roman" w:hAnsi="Times New Roman"/>
+                <w:sz w:val="18"/>
+                <w:szCs w:val="18"/>
+              </w:rPr>
+              <w:t>records;</w:t>
+            </w:r>
+            <w:proofErr w:type="gramEnd"/>
           </w:p>
           <w:p>
             <w:pPr>
@@ -32770,8 +32661,36 @@
                 <w:sz w:val="18"/>
                 <w:szCs w:val="18"/>
               </w:rPr>
-              <w:t>— Evidence of planned implementation ( real-world evidence )</w:t>
-            </w:r>
+              <w:t xml:space="preserve">— Evidence of planned implementation </w:t>
+            </w:r>
+            <w:proofErr w:type="gramStart"/>
+            <w:r>
+              <w:rPr>
+                <w:rFonts w:ascii="Times New Roman" w:hAnsi="Times New Roman"/>
+                <w:sz w:val="18"/>
+                <w:szCs w:val="18"/>
+              </w:rPr>
+              <w:t>( real</w:t>
+            </w:r>
+            <w:proofErr w:type="gramEnd"/>
+            <w:r>
+              <w:rPr>
+                <w:rFonts w:ascii="Times New Roman" w:hAnsi="Times New Roman"/>
+                <w:sz w:val="18"/>
+                <w:szCs w:val="18"/>
+              </w:rPr>
+              <w:t xml:space="preserve">-world </w:t>
+            </w:r>
+            <w:proofErr w:type="gramStart"/>
+            <w:r>
+              <w:rPr>
+                <w:rFonts w:ascii="Times New Roman" w:hAnsi="Times New Roman"/>
+                <w:sz w:val="18"/>
+                <w:szCs w:val="18"/>
+              </w:rPr>
+              <w:t>evidence )</w:t>
+            </w:r>
+            <w:proofErr w:type="gramEnd"/>
           </w:p>
           <w:p>
             <w:pPr>
@@ -32865,7 +32784,43 @@
                 <w:sz w:val="18"/>
                 <w:szCs w:val="18"/>
               </w:rPr>
-              <w:t>with its date and version , reference to harmonized standards , common specifications or applicable guidance documents,</w:t>
+              <w:t xml:space="preserve">with its date and </w:t>
+            </w:r>
+            <w:proofErr w:type="gramStart"/>
+            <w:r>
+              <w:rPr>
+                <w:rFonts w:ascii="Times New Roman" w:hAnsi="Times New Roman"/>
+                <w:sz w:val="18"/>
+                <w:szCs w:val="18"/>
+              </w:rPr>
+              <w:t>version ,</w:t>
+            </w:r>
+            <w:proofErr w:type="gramEnd"/>
+            <w:r>
+              <w:rPr>
+                <w:rFonts w:ascii="Times New Roman" w:hAnsi="Times New Roman"/>
+                <w:sz w:val="18"/>
+                <w:szCs w:val="18"/>
+              </w:rPr>
+              <w:t xml:space="preserve"> reference to harmonized </w:t>
+            </w:r>
+            <w:proofErr w:type="gramStart"/>
+            <w:r>
+              <w:rPr>
+                <w:rFonts w:ascii="Times New Roman" w:hAnsi="Times New Roman"/>
+                <w:sz w:val="18"/>
+                <w:szCs w:val="18"/>
+              </w:rPr>
+              <w:t>standards ,</w:t>
+            </w:r>
+            <w:proofErr w:type="gramEnd"/>
+            <w:r>
+              <w:rPr>
+                <w:rFonts w:ascii="Times New Roman" w:hAnsi="Times New Roman"/>
+                <w:sz w:val="18"/>
+                <w:szCs w:val="18"/>
+              </w:rPr>
+              <w:t xml:space="preserve"> common specifications or applicable guidance documents,</w:t>
             </w:r>
           </w:p>
           <w:p>
@@ -33020,27 +32975,47 @@
                 <w:sz w:val="18"/>
                 <w:szCs w:val="18"/>
               </w:rPr>
-              <w:t>proportionate to the effects of the nonconformities ?</w:t>
-            </w:r>
-          </w:p>
-          <w:p>
-            <w:pPr>
-              <w:spacing w:after="0" w:line="240" w:lineRule="auto"/>
-              <w:jc w:val="both"/>
-              <w:rPr>
-                <w:rFonts w:ascii="Times New Roman" w:hAnsi="Times New Roman"/>
-                <w:sz w:val="18"/>
-                <w:szCs w:val="18"/>
-              </w:rPr>
-            </w:pPr>
-            <w:r>
-              <w:rPr>
-                <w:rFonts w:ascii="Times New Roman" w:hAnsi="Times New Roman"/>
-                <w:sz w:val="18"/>
-                <w:szCs w:val="18"/>
-              </w:rPr>
-              <w:t>documented a procedure to define requirements for :</w:t>
-            </w:r>
+              <w:t xml:space="preserve">proportionate to the effects of the </w:t>
+            </w:r>
+            <w:proofErr w:type="gramStart"/>
+            <w:r>
+              <w:rPr>
+                <w:rFonts w:ascii="Times New Roman" w:hAnsi="Times New Roman"/>
+                <w:sz w:val="18"/>
+                <w:szCs w:val="18"/>
+              </w:rPr>
+              <w:t>nonconformities ?</w:t>
+            </w:r>
+            <w:proofErr w:type="gramEnd"/>
+          </w:p>
+          <w:p>
+            <w:pPr>
+              <w:spacing w:after="0" w:line="240" w:lineRule="auto"/>
+              <w:jc w:val="both"/>
+              <w:rPr>
+                <w:rFonts w:ascii="Times New Roman" w:hAnsi="Times New Roman"/>
+                <w:sz w:val="18"/>
+                <w:szCs w:val="18"/>
+              </w:rPr>
+            </w:pPr>
+            <w:r>
+              <w:rPr>
+                <w:rFonts w:ascii="Times New Roman" w:hAnsi="Times New Roman"/>
+                <w:sz w:val="18"/>
+                <w:szCs w:val="18"/>
+              </w:rPr>
+              <w:t xml:space="preserve">documented a procedure to define requirements </w:t>
+            </w:r>
+            <w:proofErr w:type="gramStart"/>
+            <w:r>
+              <w:rPr>
+                <w:rFonts w:ascii="Times New Roman" w:hAnsi="Times New Roman"/>
+                <w:sz w:val="18"/>
+                <w:szCs w:val="18"/>
+              </w:rPr>
+              <w:t>for :</w:t>
+            </w:r>
+            <w:proofErr w:type="gramEnd"/>
           </w:p>
           <w:p>
             <w:pPr>
@@ -33096,7 +33071,25 @@
                 <w:sz w:val="18"/>
                 <w:szCs w:val="18"/>
               </w:rPr>
-              <w:t>c) Assess the need for action to ensure that nonconformities do not reoccur,</w:t>
+              <w:t xml:space="preserve">c) Assess the need for action to ensure that nonconformities do not </w:t>
+            </w:r>
+            <w:proofErr w:type="gramStart"/>
+            <w:r>
+              <w:rPr>
+                <w:rFonts w:ascii="Times New Roman" w:hAnsi="Times New Roman"/>
+                <w:sz w:val="18"/>
+                <w:szCs w:val="18"/>
+              </w:rPr>
+              <w:t>reoccur</w:t>
+            </w:r>
+            <w:proofErr w:type="gramEnd"/>
+            <w:r>
+              <w:rPr>
+                <w:rFonts w:ascii="Times New Roman" w:hAnsi="Times New Roman"/>
+                <w:sz w:val="18"/>
+                <w:szCs w:val="18"/>
+              </w:rPr>
+              <w:t>,</w:t>
             </w:r>
           </w:p>
           <w:p>
@@ -33400,8 +33393,18 @@
                 <w:sz w:val="18"/>
                 <w:szCs w:val="18"/>
               </w:rPr>
-              <w:t>documented a procedure to define requirements for :</w:t>
-            </w:r>
+              <w:t xml:space="preserve">documented a procedure to define requirements </w:t>
+            </w:r>
+            <w:proofErr w:type="gramStart"/>
+            <w:r>
+              <w:rPr>
+                <w:rFonts w:ascii="Times New Roman" w:hAnsi="Times New Roman"/>
+                <w:sz w:val="18"/>
+                <w:szCs w:val="18"/>
+              </w:rPr>
+              <w:t>for :</w:t>
+            </w:r>
+            <w:proofErr w:type="gramEnd"/>
           </w:p>
           <w:p>
             <w:pPr>
@@ -33755,8 +33758,20 @@
                 <w:sz w:val="18"/>
                 <w:szCs w:val="18"/>
               </w:rPr>
-              <w:t>Where are the logo and other certification documents, if any, used?*</w:t>
-            </w:r>
+              <w:t xml:space="preserve">Where are the logo and other certification documents, if any, </w:t>
+            </w:r>
+            <w:proofErr w:type="gramStart"/>
+            <w:r>
+              <w:rPr>
+                <w:rFonts w:ascii="Times New Roman" w:hAnsi="Times New Roman"/>
+                <w:b/>
+                <w:bCs/>
+                <w:sz w:val="18"/>
+                <w:szCs w:val="18"/>
+              </w:rPr>
+              <w:t>used?*</w:t>
+            </w:r>
+            <w:proofErr w:type="gramEnd"/>
           </w:p>
         </w:tc>
         <w:tc>
@@ -33806,7 +33821,29 @@
                 <w:sz w:val="18"/>
                 <w:szCs w:val="18"/>
               </w:rPr>
-              <w:t>the terms of the logo usage instructions followed ?*</w:t>
+              <w:t xml:space="preserve">the terms of the logo usage instructions </w:t>
+            </w:r>
+            <w:proofErr w:type="gramStart"/>
+            <w:r>
+              <w:rPr>
+                <w:rFonts w:ascii="Times New Roman" w:hAnsi="Times New Roman"/>
+                <w:b/>
+                <w:bCs/>
+                <w:sz w:val="18"/>
+                <w:szCs w:val="18"/>
+              </w:rPr>
+              <w:t>followed ?</w:t>
+            </w:r>
+            <w:proofErr w:type="gramEnd"/>
+            <w:r>
+              <w:rPr>
+                <w:rFonts w:ascii="Times New Roman" w:hAnsi="Times New Roman"/>
+                <w:b/>
+                <w:bCs/>
+                <w:sz w:val="18"/>
+                <w:szCs w:val="18"/>
+              </w:rPr>
+              <w:t>*</w:t>
             </w:r>
           </w:p>
         </w:tc>
@@ -33857,7 +33894,29 @@
                 <w:sz w:val="18"/>
                 <w:szCs w:val="18"/>
               </w:rPr>
-              <w:t>its use on the product prohibited ?*</w:t>
+              <w:t xml:space="preserve">its use on the product </w:t>
+            </w:r>
+            <w:proofErr w:type="gramStart"/>
+            <w:r>
+              <w:rPr>
+                <w:rFonts w:ascii="Times New Roman" w:hAnsi="Times New Roman"/>
+                <w:b/>
+                <w:bCs/>
+                <w:sz w:val="18"/>
+                <w:szCs w:val="18"/>
+              </w:rPr>
+              <w:t>prohibited ?</w:t>
+            </w:r>
+            <w:proofErr w:type="gramEnd"/>
+            <w:r>
+              <w:rPr>
+                <w:rFonts w:ascii="Times New Roman" w:hAnsi="Times New Roman"/>
+                <w:b/>
+                <w:bCs/>
+                <w:sz w:val="18"/>
+                <w:szCs w:val="18"/>
+              </w:rPr>
+              <w:t>*</w:t>
             </w:r>
           </w:p>
         </w:tc>
@@ -34086,7 +34145,7 @@
           </w:p>
           <w:p>
             <w:pPr>
-              <w:pStyle w:val="ListParagraph"/>
+              <w:pStyle w:val="ListeParagraf"/>
               <w:numPr>
                 <w:ilvl w:val="0"/>
                 <w:numId w:val="38"/>
@@ -34113,7 +34172,7 @@
           </w:p>
           <w:p>
             <w:pPr>
-              <w:pStyle w:val="ListParagraph"/>
+              <w:pStyle w:val="ListeParagraf"/>
               <w:numPr>
                 <w:ilvl w:val="0"/>
                 <w:numId w:val="38"/>
@@ -34140,7 +34199,7 @@
           </w:p>
           <w:p>
             <w:pPr>
-              <w:pStyle w:val="ListParagraph"/>
+              <w:pStyle w:val="ListeParagraf"/>
               <w:numPr>
                 <w:ilvl w:val="0"/>
                 <w:numId w:val="38"/>
@@ -34167,7 +34226,7 @@
           </w:p>
           <w:p>
             <w:pPr>
-              <w:pStyle w:val="ListParagraph"/>
+              <w:pStyle w:val="ListeParagraf"/>
               <w:numPr>
                 <w:ilvl w:val="0"/>
                 <w:numId w:val="38"/>
@@ -34382,7 +34441,7 @@
     </w:p>
     <w:p>
       <w:pPr>
-        <w:pStyle w:val="BodyText"/>
+        <w:pStyle w:val="GvdeMetni"/>
         <w:rPr>
           <w:rFonts w:cs="Arial"/>
           <w:sz w:val="20"/>
@@ -34441,6 +34500,7 @@
                 <w:sz w:val="20"/>
                 <w:lang w:val="en-US"/>
               </w:rPr>
+              <w:t>Lead Auditor</w:t>
             </w:r>
           </w:p>
         </w:tc>
@@ -34464,8 +34524,9 @@
               <w:rPr>
                 <w:rFonts w:ascii="Times New Roman" w:hAnsi="Times New Roman"/>
                 <w:sz w:val="20"/>
-              </w:rPr>
-              <w:t>Certification Manager</w:t>
+                <w:lang w:val="en-US"/>
+              </w:rPr>
+              <w:t>Reviewed and approved by</w:t>
             </w:r>
           </w:p>
         </w:tc>
@@ -34489,6 +34550,9 @@
                 <w:lang w:val="en-US"/>
               </w:rPr>
             </w:pPr>
+            <w:r>
+              <w:t>{{ lead_auditor_name }}</w:t>
+            </w:r>
           </w:p>
         </w:tc>
         <w:tc>
@@ -34506,9 +34570,6 @@
                 <w:lang w:val="en-US"/>
               </w:rPr>
             </w:pPr>
-            <w:r>
-              <w:t>[SIG:APPOINTED_REVIEWER]</w:t>
-            </w:r>
           </w:p>
         </w:tc>
       </w:tr>
@@ -34538,6 +34599,7 @@
                 <w:sz w:val="20"/>
                 <w:lang w:val="en-US"/>
               </w:rPr>
+              <w:t>Signature</w:t>
             </w:r>
           </w:p>
         </w:tc>
@@ -34589,10 +34651,10 @@
             </w:pPr>
             <w:r>
               <w:rPr>
-                <w:i/>
-                <w:color w:val="B4B4B4"/>
+                <w:color w:val="FFFFFF"/>
                 <w:sz w:val="16"/>
               </w:rPr>
+              <w:t>[SIG:LEAD_AUDITOR]</w:t>
             </w:r>
           </w:p>
         </w:tc>
@@ -34613,8 +34675,7 @@
             </w:pPr>
             <w:r>
               <w:rPr>
-                <w:i/>
-                <w:color w:val="B4B4B4"/>
+                <w:color w:val="FFFFFF"/>
                 <w:sz w:val="16"/>
               </w:rPr>
               <w:t>[SIG:CB_CERT_MANAGER]</w:t>
@@ -34698,7 +34759,7 @@
         </w:tcPr>
         <w:p>
           <w:pPr>
-            <w:pStyle w:val="Header"/>
+            <w:pStyle w:val="stBilgi"/>
             <w:jc w:val="center"/>
             <w:rPr>
               <w:rFonts w:ascii="Times New Roman" w:hAnsi="Times New Roman"/>
@@ -34725,7 +34786,7 @@
         </w:tcPr>
         <w:p>
           <w:pPr>
-            <w:pStyle w:val="Header"/>
+            <w:pStyle w:val="stBilgi"/>
             <w:jc w:val="center"/>
             <w:rPr>
               <w:rFonts w:ascii="Times New Roman" w:hAnsi="Times New Roman"/>
@@ -34752,7 +34813,7 @@
         </w:tcPr>
         <w:p>
           <w:pPr>
-            <w:pStyle w:val="Header"/>
+            <w:pStyle w:val="stBilgi"/>
             <w:jc w:val="center"/>
             <w:rPr>
               <w:rFonts w:ascii="Times New Roman" w:hAnsi="Times New Roman"/>
@@ -34779,7 +34840,7 @@
         </w:tcPr>
         <w:p>
           <w:pPr>
-            <w:pStyle w:val="Header"/>
+            <w:pStyle w:val="stBilgi"/>
             <w:jc w:val="center"/>
             <w:rPr>
               <w:rFonts w:ascii="Times New Roman" w:hAnsi="Times New Roman"/>
@@ -34806,7 +34867,7 @@
         </w:tcPr>
         <w:p>
           <w:pPr>
-            <w:pStyle w:val="Header"/>
+            <w:pStyle w:val="stBilgi"/>
             <w:jc w:val="center"/>
             <w:rPr>
               <w:rFonts w:ascii="Times New Roman" w:hAnsi="Times New Roman"/>
@@ -34835,7 +34896,7 @@
         </w:tcPr>
         <w:p>
           <w:pPr>
-            <w:pStyle w:val="Header"/>
+            <w:pStyle w:val="stBilgi"/>
             <w:jc w:val="center"/>
             <w:rPr>
               <w:rFonts w:ascii="Times New Roman" w:hAnsi="Times New Roman"/>
@@ -34851,7 +34912,7 @@
               <w:szCs w:val="18"/>
               <w:lang w:val="en-GB"/>
             </w:rPr>
-            <w:t>FR.231-1</w:t>
+            <w:t>FR.232-1</w:t>
           </w:r>
         </w:p>
       </w:tc>
@@ -34862,7 +34923,7 @@
         </w:tcPr>
         <w:p>
           <w:pPr>
-            <w:pStyle w:val="Header"/>
+            <w:pStyle w:val="stBilgi"/>
             <w:jc w:val="center"/>
             <w:rPr>
               <w:rFonts w:ascii="Times New Roman" w:hAnsi="Times New Roman"/>
@@ -34889,7 +34950,7 @@
         </w:tcPr>
         <w:p>
           <w:pPr>
-            <w:pStyle w:val="Header"/>
+            <w:pStyle w:val="stBilgi"/>
             <w:jc w:val="center"/>
             <w:rPr>
               <w:rFonts w:ascii="Times New Roman" w:hAnsi="Times New Roman"/>
@@ -34916,7 +34977,7 @@
         </w:tcPr>
         <w:p>
           <w:pPr>
-            <w:pStyle w:val="Header"/>
+            <w:pStyle w:val="stBilgi"/>
             <w:jc w:val="center"/>
             <w:rPr>
               <w:rFonts w:ascii="Times New Roman" w:hAnsi="Times New Roman"/>
@@ -34943,7 +35004,7 @@
         </w:tcPr>
         <w:p>
           <w:pPr>
-            <w:pStyle w:val="Header"/>
+            <w:pStyle w:val="stBilgi"/>
             <w:jc w:val="center"/>
             <w:rPr>
               <w:rFonts w:ascii="Times New Roman" w:hAnsi="Times New Roman"/>
@@ -35069,7 +35130,7 @@
   </w:tbl>
   <w:p>
     <w:pPr>
-      <w:pStyle w:val="Footer"/>
+      <w:pStyle w:val="AltBilgi"/>
       <w:tabs>
         <w:tab w:val="center" w:pos="-1701"/>
         <w:tab w:val="left" w:pos="9072"/>
@@ -35155,7 +35216,7 @@
         </w:tcPr>
         <w:p>
           <w:pPr>
-            <w:pStyle w:val="Header"/>
+            <w:pStyle w:val="stBilgi"/>
             <w:jc w:val="center"/>
             <w:rPr>
               <w:rFonts w:ascii="Times New Roman" w:hAnsi="Times New Roman"/>
@@ -35177,7 +35238,7 @@
         </w:tcPr>
         <w:p>
           <w:pPr>
-            <w:pStyle w:val="Header"/>
+            <w:pStyle w:val="stBilgi"/>
             <w:jc w:val="center"/>
           </w:pPr>
           <w:r>
@@ -35236,7 +35297,7 @@
         </w:tcPr>
         <w:p>
           <w:pPr>
-            <w:pStyle w:val="Header"/>
+            <w:pStyle w:val="stBilgi"/>
             <w:jc w:val="center"/>
             <w:rPr>
               <w:rFonts w:ascii="Times New Roman" w:hAnsi="Times New Roman"/>
@@ -35262,7 +35323,7 @@
         </w:tcPr>
         <w:p>
           <w:pPr>
-            <w:pStyle w:val="Header"/>
+            <w:pStyle w:val="stBilgi"/>
             <w:jc w:val="center"/>
             <w:rPr>
               <w:noProof/>
@@ -35274,7 +35335,7 @@
   </w:tbl>
   <w:p>
     <w:pPr>
-      <w:pStyle w:val="Header"/>
+      <w:pStyle w:val="stBilgi"/>
     </w:pPr>
   </w:p>
 </w:hdr>
@@ -39636,11 +39697,11 @@
       <w:lang w:eastAsia="en-US"/>
     </w:rPr>
   </w:style>
-  <w:style w:type="paragraph" w:styleId="Heading1">
+  <w:style w:type="paragraph" w:styleId="Balk1">
     <w:name w:val="heading 1"/>
     <w:basedOn w:val="Normal"/>
     <w:next w:val="Normal"/>
-    <w:link w:val="Heading1Char"/>
+    <w:link w:val="Balk1Char"/>
     <w:uiPriority w:val="9"/>
     <w:qFormat/>
     <w:rsid w:val="008E4E78"/>
@@ -39658,11 +39719,11 @@
       <w:szCs w:val="32"/>
     </w:rPr>
   </w:style>
-  <w:style w:type="paragraph" w:styleId="Heading2">
+  <w:style w:type="paragraph" w:styleId="Balk2">
     <w:name w:val="heading 2"/>
     <w:basedOn w:val="Normal"/>
     <w:next w:val="Normal"/>
-    <w:link w:val="Heading2Char"/>
+    <w:link w:val="Balk2Char"/>
     <w:uiPriority w:val="9"/>
     <w:qFormat/>
     <w:rsid w:val="008E4E78"/>
@@ -39681,11 +39742,11 @@
       <w:szCs w:val="28"/>
     </w:rPr>
   </w:style>
-  <w:style w:type="paragraph" w:styleId="Heading3">
+  <w:style w:type="paragraph" w:styleId="Balk3">
     <w:name w:val="heading 3"/>
     <w:basedOn w:val="Normal"/>
     <w:next w:val="Normal"/>
-    <w:link w:val="Heading3Char"/>
+    <w:link w:val="Balk3Char"/>
     <w:uiPriority w:val="9"/>
     <w:qFormat/>
     <w:rsid w:val="000A2A68"/>
@@ -39702,11 +39763,11 @@
       <w:szCs w:val="26"/>
     </w:rPr>
   </w:style>
-  <w:style w:type="paragraph" w:styleId="Heading4">
+  <w:style w:type="paragraph" w:styleId="Balk4">
     <w:name w:val="heading 4"/>
     <w:basedOn w:val="Normal"/>
     <w:next w:val="Normal"/>
-    <w:link w:val="Heading4Char"/>
+    <w:link w:val="Balk4Char"/>
     <w:uiPriority w:val="9"/>
     <w:qFormat/>
     <w:rsid w:val="008E4E78"/>
@@ -39723,11 +39784,11 @@
       <w:szCs w:val="28"/>
     </w:rPr>
   </w:style>
-  <w:style w:type="paragraph" w:styleId="Heading5">
+  <w:style w:type="paragraph" w:styleId="Balk5">
     <w:name w:val="heading 5"/>
     <w:basedOn w:val="Normal"/>
     <w:next w:val="Normal"/>
-    <w:link w:val="Heading5Char"/>
+    <w:link w:val="Balk5Char"/>
     <w:uiPriority w:val="9"/>
     <w:unhideWhenUsed/>
     <w:qFormat/>
@@ -39745,11 +39806,11 @@
       <w:lang w:eastAsia="tr-TR"/>
     </w:rPr>
   </w:style>
-  <w:style w:type="paragraph" w:styleId="Heading6">
+  <w:style w:type="paragraph" w:styleId="Balk6">
     <w:name w:val="heading 6"/>
     <w:basedOn w:val="Normal"/>
     <w:next w:val="Normal"/>
-    <w:link w:val="Heading6Char"/>
+    <w:link w:val="Balk6Char"/>
     <w:uiPriority w:val="9"/>
     <w:unhideWhenUsed/>
     <w:qFormat/>
@@ -39768,11 +39829,11 @@
       <w:lang w:eastAsia="tr-TR"/>
     </w:rPr>
   </w:style>
-  <w:style w:type="paragraph" w:styleId="Heading7">
+  <w:style w:type="paragraph" w:styleId="Balk7">
     <w:name w:val="heading 7"/>
     <w:basedOn w:val="Normal"/>
     <w:next w:val="Normal"/>
-    <w:link w:val="Heading7Char"/>
+    <w:link w:val="Balk7Char"/>
     <w:uiPriority w:val="9"/>
     <w:qFormat/>
     <w:rsid w:val="008E4E78"/>
@@ -39786,11 +39847,11 @@
       <w:szCs w:val="24"/>
     </w:rPr>
   </w:style>
-  <w:style w:type="paragraph" w:styleId="Heading8">
+  <w:style w:type="paragraph" w:styleId="Balk8">
     <w:name w:val="heading 8"/>
     <w:basedOn w:val="Normal"/>
     <w:next w:val="Normal"/>
-    <w:link w:val="Heading8Char"/>
+    <w:link w:val="Balk8Char"/>
     <w:uiPriority w:val="9"/>
     <w:unhideWhenUsed/>
     <w:qFormat/>
@@ -39807,11 +39868,11 @@
       <w:szCs w:val="24"/>
     </w:rPr>
   </w:style>
-  <w:style w:type="paragraph" w:styleId="Heading9">
+  <w:style w:type="paragraph" w:styleId="Balk9">
     <w:name w:val="heading 9"/>
     <w:basedOn w:val="Normal"/>
     <w:next w:val="Normal"/>
-    <w:link w:val="Heading9Char"/>
+    <w:link w:val="Balk9Char"/>
     <w:uiPriority w:val="9"/>
     <w:unhideWhenUsed/>
     <w:qFormat/>
@@ -39833,13 +39894,13 @@
       <w:lang w:eastAsia="tr-TR"/>
     </w:rPr>
   </w:style>
-  <w:style w:type="character" w:default="1" w:styleId="DefaultParagraphFont">
+  <w:style w:type="character" w:default="1" w:styleId="VarsaylanParagrafYazTipi">
     <w:name w:val="Default Paragraph Font"/>
     <w:uiPriority w:val="1"/>
     <w:semiHidden/>
     <w:unhideWhenUsed/>
   </w:style>
-  <w:style w:type="table" w:default="1" w:styleId="TableNormal">
+  <w:style w:type="table" w:default="1" w:styleId="NormalTablo">
     <w:name w:val="Normal Table"/>
     <w:uiPriority w:val="99"/>
     <w:semiHidden/>
@@ -39854,17 +39915,17 @@
       </w:tblCellMar>
     </w:tblPr>
   </w:style>
-  <w:style w:type="numbering" w:default="1" w:styleId="NoList">
+  <w:style w:type="numbering" w:default="1" w:styleId="ListeYok">
     <w:name w:val="No List"/>
     <w:uiPriority w:val="99"/>
     <w:semiHidden/>
     <w:unhideWhenUsed/>
   </w:style>
-  <w:style w:type="paragraph" w:styleId="Header">
+  <w:style w:type="paragraph" w:styleId="stBilgi">
     <w:name w:val="header"/>
     <w:aliases w:val="Üstbilgi"/>
     <w:basedOn w:val="Normal"/>
-    <w:link w:val="HeaderChar"/>
+    <w:link w:val="stBilgiChar"/>
     <w:uiPriority w:val="99"/>
     <w:unhideWhenUsed/>
     <w:rsid w:val="009874B7"/>
@@ -39876,18 +39937,18 @@
       <w:spacing w:after="0" w:line="240" w:lineRule="auto"/>
     </w:pPr>
   </w:style>
-  <w:style w:type="character" w:customStyle="1" w:styleId="HeaderChar">
-    <w:name w:val="Header Char"/>
+  <w:style w:type="character" w:customStyle="1" w:styleId="stBilgiChar">
+    <w:name w:val="Üst Bilgi Char"/>
     <w:aliases w:val="Üstbilgi Char1"/>
-    <w:basedOn w:val="DefaultParagraphFont"/>
-    <w:link w:val="Header"/>
+    <w:basedOn w:val="VarsaylanParagrafYazTipi"/>
+    <w:link w:val="stBilgi"/>
     <w:uiPriority w:val="99"/>
     <w:rsid w:val="009874B7"/>
   </w:style>
-  <w:style w:type="paragraph" w:styleId="Footer">
+  <w:style w:type="paragraph" w:styleId="AltBilgi">
     <w:name w:val="footer"/>
     <w:basedOn w:val="Normal"/>
-    <w:link w:val="FooterChar"/>
+    <w:link w:val="AltBilgiChar"/>
     <w:uiPriority w:val="99"/>
     <w:unhideWhenUsed/>
     <w:rsid w:val="009874B7"/>
@@ -39899,17 +39960,17 @@
       <w:spacing w:after="0" w:line="240" w:lineRule="auto"/>
     </w:pPr>
   </w:style>
-  <w:style w:type="character" w:customStyle="1" w:styleId="FooterChar">
-    <w:name w:val="Footer Char"/>
-    <w:basedOn w:val="DefaultParagraphFont"/>
-    <w:link w:val="Footer"/>
+  <w:style w:type="character" w:customStyle="1" w:styleId="AltBilgiChar">
+    <w:name w:val="Alt Bilgi Char"/>
+    <w:basedOn w:val="VarsaylanParagrafYazTipi"/>
+    <w:link w:val="AltBilgi"/>
     <w:uiPriority w:val="99"/>
     <w:rsid w:val="009874B7"/>
   </w:style>
-  <w:style w:type="paragraph" w:styleId="BalloonText">
+  <w:style w:type="paragraph" w:styleId="BalonMetni">
     <w:name w:val="Balloon Text"/>
     <w:basedOn w:val="Normal"/>
-    <w:link w:val="BalloonTextChar"/>
+    <w:link w:val="BalonMetniChar"/>
     <w:unhideWhenUsed/>
     <w:rsid w:val="009874B7"/>
     <w:pPr>
@@ -39921,9 +39982,9 @@
       <w:szCs w:val="16"/>
     </w:rPr>
   </w:style>
-  <w:style w:type="character" w:customStyle="1" w:styleId="BalloonTextChar">
-    <w:name w:val="Balloon Text Char"/>
-    <w:link w:val="BalloonText"/>
+  <w:style w:type="character" w:customStyle="1" w:styleId="BalonMetniChar">
+    <w:name w:val="Balon Metni Char"/>
+    <w:link w:val="BalonMetni"/>
     <w:uiPriority w:val="99"/>
     <w:semiHidden/>
     <w:rsid w:val="009874B7"/>
@@ -39933,9 +39994,9 @@
       <w:szCs w:val="16"/>
     </w:rPr>
   </w:style>
-  <w:style w:type="table" w:styleId="TableGrid">
+  <w:style w:type="table" w:styleId="TabloKlavuzu">
     <w:name w:val="Table Grid"/>
-    <w:basedOn w:val="TableNormal"/>
+    <w:basedOn w:val="NormalTablo"/>
     <w:rsid w:val="009874B7"/>
     <w:tblPr>
       <w:tblBorders>
@@ -39948,14 +40009,14 @@
       </w:tblBorders>
     </w:tblPr>
   </w:style>
-  <w:style w:type="character" w:styleId="PageNumber">
+  <w:style w:type="character" w:styleId="SayfaNumaras">
     <w:name w:val="page number"/>
-    <w:basedOn w:val="DefaultParagraphFont"/>
+    <w:basedOn w:val="VarsaylanParagrafYazTipi"/>
     <w:rsid w:val="00BE1233"/>
   </w:style>
-  <w:style w:type="character" w:customStyle="1" w:styleId="Heading1Char">
-    <w:name w:val="Heading 1 Char"/>
-    <w:link w:val="Heading1"/>
+  <w:style w:type="character" w:customStyle="1" w:styleId="Balk1Char">
+    <w:name w:val="Başlık 1 Char"/>
+    <w:link w:val="Balk1"/>
     <w:uiPriority w:val="9"/>
     <w:rsid w:val="008E4E78"/>
     <w:rPr>
@@ -39968,9 +40029,9 @@
       <w:lang w:val="en" w:eastAsia="en-US"/>
     </w:rPr>
   </w:style>
-  <w:style w:type="character" w:customStyle="1" w:styleId="Heading2Char">
-    <w:name w:val="Heading 2 Char"/>
-    <w:link w:val="Heading2"/>
+  <w:style w:type="character" w:customStyle="1" w:styleId="Balk2Char">
+    <w:name w:val="Başlık 2 Char"/>
+    <w:link w:val="Balk2"/>
     <w:uiPriority w:val="9"/>
     <w:rsid w:val="008E4E78"/>
     <w:rPr>
@@ -39984,9 +40045,9 @@
       <w:lang w:val="en" w:eastAsia="en-US"/>
     </w:rPr>
   </w:style>
-  <w:style w:type="character" w:customStyle="1" w:styleId="Heading4Char">
-    <w:name w:val="Heading 4 Char"/>
-    <w:link w:val="Heading4"/>
+  <w:style w:type="character" w:customStyle="1" w:styleId="Balk4Char">
+    <w:name w:val="Başlık 4 Char"/>
+    <w:link w:val="Balk4"/>
     <w:uiPriority w:val="9"/>
     <w:rsid w:val="008E4E78"/>
     <w:rPr>
@@ -39998,9 +40059,9 @@
       <w:lang w:val="en" w:eastAsia="en-US"/>
     </w:rPr>
   </w:style>
-  <w:style w:type="character" w:customStyle="1" w:styleId="Heading7Char">
-    <w:name w:val="Heading 7 Char"/>
-    <w:link w:val="Heading7"/>
+  <w:style w:type="character" w:customStyle="1" w:styleId="Balk7Char">
+    <w:name w:val="Başlık 7 Char"/>
+    <w:link w:val="Balk7"/>
     <w:uiPriority w:val="9"/>
     <w:rsid w:val="008E4E78"/>
     <w:rPr>
@@ -40010,10 +40071,10 @@
       <w:lang w:val="en" w:eastAsia="en-US"/>
     </w:rPr>
   </w:style>
-  <w:style w:type="paragraph" w:styleId="BodyText">
+  <w:style w:type="paragraph" w:styleId="GvdeMetni">
     <w:name w:val="Body Text"/>
     <w:basedOn w:val="Normal"/>
-    <w:link w:val="BodyTextChar"/>
+    <w:link w:val="GvdeMetniChar"/>
     <w:rsid w:val="008E4E78"/>
     <w:pPr>
       <w:spacing w:after="0" w:line="240" w:lineRule="auto"/>
@@ -40025,9 +40086,9 @@
       <w:szCs w:val="20"/>
     </w:rPr>
   </w:style>
-  <w:style w:type="character" w:customStyle="1" w:styleId="BodyTextChar">
-    <w:name w:val="Body Text Char"/>
-    <w:link w:val="BodyText"/>
+  <w:style w:type="character" w:customStyle="1" w:styleId="GvdeMetniChar">
+    <w:name w:val="Gövde Metni Char"/>
+    <w:link w:val="GvdeMetni"/>
     <w:rsid w:val="008E4E78"/>
     <w:rPr>
       <w:rFonts w:ascii="Times New Roman" w:eastAsia="Times New Roman" w:hAnsi="Times New Roman"/>
@@ -40035,10 +40096,10 @@
       <w:lang w:val="en"/>
     </w:rPr>
   </w:style>
-  <w:style w:type="paragraph" w:styleId="BodyText2">
+  <w:style w:type="paragraph" w:styleId="GvdeMetni2">
     <w:name w:val="Body Text 2"/>
     <w:basedOn w:val="Normal"/>
-    <w:link w:val="BodyText2Char"/>
+    <w:link w:val="GvdeMetni2Char"/>
     <w:uiPriority w:val="99"/>
     <w:unhideWhenUsed/>
     <w:rsid w:val="008E4E78"/>
@@ -40046,9 +40107,9 @@
       <w:spacing w:after="120" w:line="480" w:lineRule="auto"/>
     </w:pPr>
   </w:style>
-  <w:style w:type="character" w:customStyle="1" w:styleId="BodyText2Char">
-    <w:name w:val="Body Text 2 Char"/>
-    <w:link w:val="BodyText2"/>
+  <w:style w:type="character" w:customStyle="1" w:styleId="GvdeMetni2Char">
+    <w:name w:val="Gövde Metni 2 Char"/>
+    <w:link w:val="GvdeMetni2"/>
     <w:uiPriority w:val="99"/>
     <w:rsid w:val="008E4E78"/>
     <w:rPr>
@@ -40057,7 +40118,7 @@
       <w:lang w:val="en" w:eastAsia="en-US"/>
     </w:rPr>
   </w:style>
-  <w:style w:type="character" w:styleId="Hyperlink">
+  <w:style w:type="character" w:styleId="Kpr">
     <w:name w:val="Hyperlink"/>
     <w:rsid w:val="008E4E78"/>
     <w:rPr>
@@ -40065,7 +40126,7 @@
       <w:u w:val="single"/>
     </w:rPr>
   </w:style>
-  <w:style w:type="character" w:styleId="FollowedHyperlink">
+  <w:style w:type="character" w:styleId="zlenenKpr">
     <w:name w:val="FollowedHyperlink"/>
     <w:unhideWhenUsed/>
     <w:rsid w:val="00590810"/>
@@ -40074,9 +40135,9 @@
       <w:u w:val="single"/>
     </w:rPr>
   </w:style>
-  <w:style w:type="character" w:customStyle="1" w:styleId="Heading3Char">
-    <w:name w:val="Heading 3 Char"/>
-    <w:link w:val="Heading3"/>
+  <w:style w:type="character" w:customStyle="1" w:styleId="Balk3Char">
+    <w:name w:val="Başlık 3 Char"/>
+    <w:link w:val="Balk3"/>
     <w:uiPriority w:val="9"/>
     <w:rsid w:val="000A2A68"/>
     <w:rPr>
@@ -40088,10 +40149,10 @@
       <w:lang w:val="en" w:eastAsia="en-US"/>
     </w:rPr>
   </w:style>
-  <w:style w:type="character" w:customStyle="1" w:styleId="Heading5Char">
-    <w:name w:val="Heading 5 Char"/>
-    <w:basedOn w:val="DefaultParagraphFont"/>
-    <w:link w:val="Heading5"/>
+  <w:style w:type="character" w:customStyle="1" w:styleId="Balk5Char">
+    <w:name w:val="Başlık 5 Char"/>
+    <w:basedOn w:val="VarsaylanParagrafYazTipi"/>
+    <w:link w:val="Balk5"/>
     <w:uiPriority w:val="9"/>
     <w:rsid w:val="00C138D8"/>
     <w:rPr>
@@ -40102,10 +40163,10 @@
       <w:szCs w:val="22"/>
     </w:rPr>
   </w:style>
-  <w:style w:type="character" w:customStyle="1" w:styleId="Heading6Char">
-    <w:name w:val="Heading 6 Char"/>
-    <w:basedOn w:val="DefaultParagraphFont"/>
-    <w:link w:val="Heading6"/>
+  <w:style w:type="character" w:customStyle="1" w:styleId="Balk6Char">
+    <w:name w:val="Başlık 6 Char"/>
+    <w:basedOn w:val="VarsaylanParagrafYazTipi"/>
+    <w:link w:val="Balk6"/>
     <w:uiPriority w:val="9"/>
     <w:rsid w:val="00C138D8"/>
     <w:rPr>
@@ -40115,10 +40176,10 @@
       <w:szCs w:val="21"/>
     </w:rPr>
   </w:style>
-  <w:style w:type="character" w:customStyle="1" w:styleId="Heading8Char">
-    <w:name w:val="Heading 8 Char"/>
-    <w:basedOn w:val="DefaultParagraphFont"/>
-    <w:link w:val="Heading8"/>
+  <w:style w:type="character" w:customStyle="1" w:styleId="Balk8Char">
+    <w:name w:val="Başlık 8 Char"/>
+    <w:basedOn w:val="VarsaylanParagrafYazTipi"/>
+    <w:link w:val="Balk8"/>
     <w:uiPriority w:val="9"/>
     <w:rsid w:val="00C138D8"/>
     <w:rPr>
@@ -40130,10 +40191,10 @@
       <w:lang w:val="en" w:eastAsia="en-US"/>
     </w:rPr>
   </w:style>
-  <w:style w:type="character" w:customStyle="1" w:styleId="Heading9Char">
-    <w:name w:val="Heading 9 Char"/>
-    <w:basedOn w:val="DefaultParagraphFont"/>
-    <w:link w:val="Heading9"/>
+  <w:style w:type="character" w:customStyle="1" w:styleId="Balk9Char">
+    <w:name w:val="Başlık 9 Char"/>
+    <w:basedOn w:val="VarsaylanParagrafYazTipi"/>
+    <w:link w:val="Balk9"/>
     <w:uiPriority w:val="9"/>
     <w:rsid w:val="00C138D8"/>
     <w:rPr>
@@ -40153,7 +40214,7 @@
   <w:style w:type="paragraph" w:customStyle="1" w:styleId="Balk">
     <w:name w:val="Başlık"/>
     <w:basedOn w:val="Normal"/>
-    <w:next w:val="BodyText"/>
+    <w:next w:val="GvdeMetni"/>
     <w:rsid w:val="00C138D8"/>
     <w:pPr>
       <w:keepNext/>
@@ -40166,9 +40227,9 @@
       <w:lang w:eastAsia="tr-TR"/>
     </w:rPr>
   </w:style>
-  <w:style w:type="paragraph" w:styleId="List">
+  <w:style w:type="paragraph" w:styleId="Liste">
     <w:name w:val="List"/>
-    <w:basedOn w:val="BodyText"/>
+    <w:basedOn w:val="GvdeMetni"/>
     <w:rsid w:val="00C138D8"/>
     <w:pPr>
       <w:spacing w:after="120" w:line="264" w:lineRule="auto"/>
@@ -40215,7 +40276,7 @@
   <w:style w:type="paragraph" w:customStyle="1" w:styleId="stbilgi1">
     <w:name w:val="Üstbilgi1"/>
     <w:basedOn w:val="Normal"/>
-    <w:link w:val="stbilgiChar"/>
+    <w:link w:val="stbilgiChar0"/>
     <w:uiPriority w:val="99"/>
     <w:rsid w:val="00C138D8"/>
     <w:pPr>
@@ -40235,7 +40296,7 @@
   <w:style w:type="paragraph" w:customStyle="1" w:styleId="Altbilgi1">
     <w:name w:val="Altbilgi1"/>
     <w:basedOn w:val="Normal"/>
-    <w:link w:val="AltbilgiChar"/>
+    <w:link w:val="AltbilgiChar0"/>
     <w:uiPriority w:val="99"/>
     <w:rsid w:val="00C138D8"/>
     <w:pPr>
@@ -40329,10 +40390,10 @@
       <w:lang w:eastAsia="tr-TR"/>
     </w:rPr>
   </w:style>
-  <w:style w:type="paragraph" w:styleId="BodyTextIndent">
+  <w:style w:type="paragraph" w:styleId="GvdeMetniGirintisi">
     <w:name w:val="Body Text Indent"/>
     <w:basedOn w:val="Normal"/>
-    <w:link w:val="BodyTextIndentChar"/>
+    <w:link w:val="GvdeMetniGirintisiChar"/>
     <w:rsid w:val="00C138D8"/>
     <w:pPr>
       <w:spacing w:after="120" w:line="280" w:lineRule="exact"/>
@@ -40346,10 +40407,10 @@
       <w:lang w:eastAsia="tr-TR"/>
     </w:rPr>
   </w:style>
-  <w:style w:type="character" w:customStyle="1" w:styleId="BodyTextIndentChar">
-    <w:name w:val="Body Text Indent Char"/>
-    <w:basedOn w:val="DefaultParagraphFont"/>
-    <w:link w:val="BodyTextIndent"/>
+  <w:style w:type="character" w:customStyle="1" w:styleId="GvdeMetniGirintisiChar">
+    <w:name w:val="Gövde Metni Girintisi Char"/>
+    <w:basedOn w:val="VarsaylanParagrafYazTipi"/>
+    <w:link w:val="GvdeMetniGirintisi"/>
     <w:rsid w:val="00C138D8"/>
     <w:rPr>
       <w:rFonts w:ascii="Arial" w:eastAsia="Times New Roman" w:hAnsi="Arial" w:cs="Arial"/>
@@ -40383,11 +40444,11 @@
       <w:lang w:eastAsia="ar-SA"/>
     </w:rPr>
   </w:style>
-  <w:style w:type="paragraph" w:styleId="Title">
+  <w:style w:type="paragraph" w:styleId="KonuBal">
     <w:name w:val="Title"/>
     <w:basedOn w:val="Normal"/>
     <w:next w:val="Normal"/>
-    <w:link w:val="TitleChar"/>
+    <w:link w:val="KonuBalChar"/>
     <w:uiPriority w:val="1"/>
     <w:qFormat/>
     <w:rsid w:val="00C138D8"/>
@@ -40404,10 +40465,10 @@
       <w:lang w:eastAsia="tr-TR"/>
     </w:rPr>
   </w:style>
-  <w:style w:type="character" w:customStyle="1" w:styleId="TitleChar">
-    <w:name w:val="Title Char"/>
-    <w:basedOn w:val="DefaultParagraphFont"/>
-    <w:link w:val="Title"/>
+  <w:style w:type="character" w:customStyle="1" w:styleId="KonuBalChar">
+    <w:name w:val="Konu Başlığı Char"/>
+    <w:basedOn w:val="VarsaylanParagrafYazTipi"/>
+    <w:link w:val="KonuBal"/>
     <w:uiPriority w:val="10"/>
     <w:rsid w:val="00C138D8"/>
     <w:rPr>
@@ -40421,7 +40482,7 @@
   <w:style w:type="paragraph" w:customStyle="1" w:styleId="AltKonuBal1">
     <w:name w:val="Alt Konu Başlığı1"/>
     <w:basedOn w:val="Balk"/>
-    <w:next w:val="BodyText"/>
+    <w:next w:val="GvdeMetni"/>
     <w:rsid w:val="00C138D8"/>
     <w:pPr>
       <w:jc w:val="center"/>
@@ -40460,7 +40521,7 @@
   </w:style>
   <w:style w:type="paragraph" w:customStyle="1" w:styleId="ereveierii">
     <w:name w:val="Çerçeve içeriği"/>
-    <w:basedOn w:val="BodyText"/>
+    <w:basedOn w:val="GvdeMetni"/>
     <w:rsid w:val="00C138D8"/>
     <w:pPr>
       <w:spacing w:after="120" w:line="264" w:lineRule="auto"/>
@@ -40473,7 +40534,7 @@
       <w:lang w:eastAsia="tr-TR"/>
     </w:rPr>
   </w:style>
-  <w:style w:type="character" w:customStyle="1" w:styleId="stbilgiChar">
+  <w:style w:type="character" w:customStyle="1" w:styleId="stbilgiChar0">
     <w:name w:val="Üstbilgi Char"/>
     <w:link w:val="stbilgi1"/>
     <w:uiPriority w:val="99"/>
@@ -40484,7 +40545,7 @@
       <w:szCs w:val="21"/>
     </w:rPr>
   </w:style>
-  <w:style w:type="character" w:customStyle="1" w:styleId="AltbilgiChar">
+  <w:style w:type="character" w:customStyle="1" w:styleId="AltbilgiChar0">
     <w:name w:val="Altbilgi Char"/>
     <w:link w:val="Altbilgi1"/>
     <w:uiPriority w:val="99"/>
@@ -40495,7 +40556,7 @@
       <w:szCs w:val="21"/>
     </w:rPr>
   </w:style>
-  <w:style w:type="paragraph" w:styleId="Caption">
+  <w:style w:type="paragraph" w:styleId="ResimYazs">
     <w:name w:val="caption"/>
     <w:basedOn w:val="Normal"/>
     <w:next w:val="Normal"/>
@@ -40517,11 +40578,11 @@
       <w:lang w:eastAsia="tr-TR"/>
     </w:rPr>
   </w:style>
-  <w:style w:type="paragraph" w:styleId="Subtitle">
+  <w:style w:type="paragraph" w:styleId="Altyaz">
     <w:name w:val="Subtitle"/>
     <w:basedOn w:val="Normal"/>
     <w:next w:val="Normal"/>
-    <w:link w:val="SubtitleChar"/>
+    <w:link w:val="AltyazChar"/>
     <w:uiPriority w:val="11"/>
     <w:qFormat/>
     <w:rsid w:val="00C138D8"/>
@@ -40539,10 +40600,10 @@
       <w:lang w:eastAsia="tr-TR"/>
     </w:rPr>
   </w:style>
-  <w:style w:type="character" w:customStyle="1" w:styleId="SubtitleChar">
-    <w:name w:val="Subtitle Char"/>
-    <w:basedOn w:val="DefaultParagraphFont"/>
-    <w:link w:val="Subtitle"/>
+  <w:style w:type="character" w:customStyle="1" w:styleId="AltyazChar">
+    <w:name w:val="Altyazı Char"/>
+    <w:basedOn w:val="VarsaylanParagrafYazTipi"/>
+    <w:link w:val="Altyaz"/>
     <w:uiPriority w:val="11"/>
     <w:rsid w:val="00C138D8"/>
     <w:rPr>
@@ -40552,7 +40613,7 @@
       <w:szCs w:val="30"/>
     </w:rPr>
   </w:style>
-  <w:style w:type="character" w:styleId="Strong">
+  <w:style w:type="character" w:styleId="Gl">
     <w:name w:val="Strong"/>
     <w:uiPriority w:val="22"/>
     <w:qFormat/>
@@ -40562,7 +40623,7 @@
       <w:bCs/>
     </w:rPr>
   </w:style>
-  <w:style w:type="character" w:styleId="Emphasis">
+  <w:style w:type="character" w:styleId="Vurgu">
     <w:name w:val="Emphasis"/>
     <w:uiPriority w:val="20"/>
     <w:qFormat/>
@@ -40572,7 +40633,7 @@
       <w:iCs/>
     </w:rPr>
   </w:style>
-  <w:style w:type="paragraph" w:styleId="NoSpacing">
+  <w:style w:type="paragraph" w:styleId="AralkYok">
     <w:name w:val="No Spacing"/>
     <w:uiPriority w:val="1"/>
     <w:qFormat/>
@@ -40583,11 +40644,11 @@
       <w:szCs w:val="21"/>
     </w:rPr>
   </w:style>
-  <w:style w:type="paragraph" w:styleId="Quote">
+  <w:style w:type="paragraph" w:styleId="Alnt">
     <w:name w:val="Quote"/>
     <w:basedOn w:val="Normal"/>
     <w:next w:val="Normal"/>
-    <w:link w:val="QuoteChar"/>
+    <w:link w:val="AlntChar"/>
     <w:uiPriority w:val="29"/>
     <w:qFormat/>
     <w:rsid w:val="00C138D8"/>
@@ -40605,10 +40666,10 @@
       <w:lang w:eastAsia="tr-TR"/>
     </w:rPr>
   </w:style>
-  <w:style w:type="character" w:customStyle="1" w:styleId="QuoteChar">
-    <w:name w:val="Quote Char"/>
-    <w:basedOn w:val="DefaultParagraphFont"/>
-    <w:link w:val="Quote"/>
+  <w:style w:type="character" w:customStyle="1" w:styleId="AlntChar">
+    <w:name w:val="Alıntı Char"/>
+    <w:basedOn w:val="VarsaylanParagrafYazTipi"/>
+    <w:link w:val="Alnt"/>
     <w:uiPriority w:val="29"/>
     <w:rsid w:val="00C138D8"/>
     <w:rPr>
@@ -40619,11 +40680,11 @@
       <w:szCs w:val="21"/>
     </w:rPr>
   </w:style>
-  <w:style w:type="paragraph" w:styleId="IntenseQuote">
+  <w:style w:type="paragraph" w:styleId="GlAlnt">
     <w:name w:val="Intense Quote"/>
     <w:basedOn w:val="Normal"/>
     <w:next w:val="Normal"/>
-    <w:link w:val="IntenseQuoteChar"/>
+    <w:link w:val="GlAlntChar"/>
     <w:uiPriority w:val="30"/>
     <w:qFormat/>
     <w:rsid w:val="00C138D8"/>
@@ -40640,10 +40701,10 @@
       <w:lang w:eastAsia="tr-TR"/>
     </w:rPr>
   </w:style>
-  <w:style w:type="character" w:customStyle="1" w:styleId="IntenseQuoteChar">
-    <w:name w:val="Intense Quote Char"/>
-    <w:basedOn w:val="DefaultParagraphFont"/>
-    <w:link w:val="IntenseQuote"/>
+  <w:style w:type="character" w:customStyle="1" w:styleId="GlAlntChar">
+    <w:name w:val="Güçlü Alıntı Char"/>
+    <w:basedOn w:val="VarsaylanParagrafYazTipi"/>
+    <w:link w:val="GlAlnt"/>
     <w:uiPriority w:val="30"/>
     <w:rsid w:val="00C138D8"/>
     <w:rPr>
@@ -40653,7 +40714,7 @@
       <w:szCs w:val="28"/>
     </w:rPr>
   </w:style>
-  <w:style w:type="character" w:styleId="SubtleEmphasis">
+  <w:style w:type="character" w:styleId="HafifVurgulama">
     <w:name w:val="Subtle Emphasis"/>
     <w:uiPriority w:val="19"/>
     <w:qFormat/>
@@ -40664,7 +40725,7 @@
       <w:color w:val="595959"/>
     </w:rPr>
   </w:style>
-  <w:style w:type="character" w:styleId="IntenseEmphasis">
+  <w:style w:type="character" w:styleId="GlVurgulama">
     <w:name w:val="Intense Emphasis"/>
     <w:uiPriority w:val="21"/>
     <w:qFormat/>
@@ -40676,7 +40737,7 @@
       <w:iCs/>
     </w:rPr>
   </w:style>
-  <w:style w:type="character" w:styleId="SubtleReference">
+  <w:style w:type="character" w:styleId="HafifBavuru">
     <w:name w:val="Subtle Reference"/>
     <w:uiPriority w:val="31"/>
     <w:qFormat/>
@@ -40686,7 +40747,7 @@
       <w:color w:val="404040"/>
     </w:rPr>
   </w:style>
-  <w:style w:type="character" w:styleId="IntenseReference">
+  <w:style w:type="character" w:styleId="GlBavuru">
     <w:name w:val="Intense Reference"/>
     <w:uiPriority w:val="32"/>
     <w:qFormat/>
@@ -40698,7 +40759,7 @@
       <w:u w:val="single"/>
     </w:rPr>
   </w:style>
-  <w:style w:type="character" w:styleId="BookTitle">
+  <w:style w:type="character" w:styleId="KitapBal">
     <w:name w:val="Book Title"/>
     <w:uiPriority w:val="33"/>
     <w:qFormat/>
@@ -40709,9 +40770,9 @@
       <w:smallCaps/>
     </w:rPr>
   </w:style>
-  <w:style w:type="paragraph" w:styleId="TOCHeading">
+  <w:style w:type="paragraph" w:styleId="TBal">
     <w:name w:val="TOC Heading"/>
-    <w:basedOn w:val="Heading1"/>
+    <w:basedOn w:val="Balk1"/>
     <w:next w:val="Normal"/>
     <w:uiPriority w:val="39"/>
     <w:semiHidden/>
@@ -40737,7 +40798,7 @@
       <w:lang w:eastAsia="tr-TR"/>
     </w:rPr>
   </w:style>
-  <w:style w:type="character" w:styleId="PlaceholderText">
+  <w:style w:type="character" w:styleId="YerTutucuMetni">
     <w:name w:val="Placeholder Text"/>
     <w:uiPriority w:val="99"/>
     <w:semiHidden/>
@@ -40746,7 +40807,7 @@
       <w:color w:val="808080"/>
     </w:rPr>
   </w:style>
-  <w:style w:type="paragraph" w:styleId="ListParagraph">
+  <w:style w:type="paragraph" w:styleId="ListeParagraf">
     <w:name w:val="List Paragraph"/>
     <w:basedOn w:val="Normal"/>
     <w:uiPriority w:val="34"/>
@@ -40767,7 +40828,7 @@
   <w:style w:type="paragraph" w:customStyle="1" w:styleId="a">
     <w:name w:val="a"/>
     <w:basedOn w:val="Normal"/>
-    <w:next w:val="Header"/>
+    <w:next w:val="stBilgi"/>
     <w:uiPriority w:val="99"/>
     <w:unhideWhenUsed/>
     <w:rsid w:val="00597489"/>
@@ -40786,21 +40847,8 @@
   </w:style>
   <w:style w:type="character" w:customStyle="1" w:styleId="ts-alignment-element">
     <w:name w:val="ts-alignment-element"/>
-    <w:basedOn w:val="DefaultParagraphFont"/>
+    <w:basedOn w:val="VarsaylanParagrafYazTipi"/>
     <w:rsid w:val="005A1E54"/>
-  </w:style>
-  <w:style w:type="character" w:styleId="HTMLCode">
-    <w:name w:val="HTML Code"/>
-    <w:basedOn w:val="DefaultParagraphFont"/>
-    <w:uiPriority w:val="99"/>
-    <w:semiHidden/>
-    <w:unhideWhenUsed/>
-    <w:rsid w:val="00044176"/>
-    <w:rPr>
-      <w:rFonts w:ascii="Courier New" w:eastAsia="Times New Roman" w:hAnsi="Courier New" w:cs="Courier New"/>
-      <w:sz w:val="20"/>
-      <w:szCs w:val="20"/>
-    </w:rPr>
   </w:style>
 </w:styles>
 </file>

</xml_diff>